<commit_message>
Update source code, added exam data and parsing scripts
</commit_message>
<xml_diff>
--- a/Đề cương ôn thi lớp 7/Tin học.docx
+++ b/Đề cương ôn thi lớp 7/Tin học.docx
@@ -2,197 +2,6 @@
 <file path=word/document.xml><?xml version="1.0" encoding="utf-8"?>
 <w:document xmlns:wpc="http://schemas.microsoft.com/office/word/2010/wordprocessingCanvas" xmlns:cx="http://schemas.microsoft.com/office/drawing/2014/chartex" xmlns:mc="http://schemas.openxmlformats.org/markup-compatibility/2006" xmlns:o="urn:schemas-microsoft-com:office:office" xmlns:r="http://schemas.openxmlformats.org/officeDocument/2006/relationships" xmlns:m="http://schemas.openxmlformats.org/officeDocument/2006/math" xmlns:v="urn:schemas-microsoft-com:vml" xmlns:wp14="http://schemas.microsoft.com/office/word/2010/wordprocessingDrawing" xmlns:wp="http://schemas.openxmlformats.org/drawingml/2006/wordprocessingDrawing" xmlns:w10="urn:schemas-microsoft-com:office:word" xmlns:w="http://schemas.openxmlformats.org/wordprocessingml/2006/main" xmlns:w14="http://schemas.microsoft.com/office/word/2010/wordml" xmlns:w15="http://schemas.microsoft.com/office/word/2012/wordml" xmlns:w16se="http://schemas.microsoft.com/office/word/2015/wordml/symex" xmlns:wpg="http://schemas.microsoft.com/office/word/2010/wordprocessingGroup" xmlns:wpi="http://schemas.microsoft.com/office/word/2010/wordprocessingInk" xmlns:wne="http://schemas.microsoft.com/office/word/2006/wordml" xmlns:wps="http://schemas.microsoft.com/office/word/2010/wordprocessingShape" mc:Ignorable="w14 w15 w16se wp14">
   <w:body>
-    <w:tbl>
-      <w:tblPr>
-        <w:tblStyle w:val="TableGrid"/>
-        <w:tblW w:w="0" w:type="auto"/>
-        <w:tblBorders>
-          <w:top w:val="none" w:sz="0" w:space="0" w:color="auto"/>
-          <w:left w:val="none" w:sz="0" w:space="0" w:color="auto"/>
-          <w:bottom w:val="none" w:sz="0" w:space="0" w:color="auto"/>
-          <w:right w:val="none" w:sz="0" w:space="0" w:color="auto"/>
-          <w:insideH w:val="none" w:sz="0" w:space="0" w:color="auto"/>
-          <w:insideV w:val="none" w:sz="0" w:space="0" w:color="auto"/>
-        </w:tblBorders>
-        <w:tblLook w:val="04A0" w:firstRow="1" w:lastRow="0" w:firstColumn="1" w:lastColumn="0" w:noHBand="0" w:noVBand="1"/>
-      </w:tblPr>
-      <w:tblGrid>
-        <w:gridCol w:w="4690"/>
-        <w:gridCol w:w="4670"/>
-      </w:tblGrid>
-      <w:tr>
-        <w:tc>
-          <w:tcPr>
-            <w:tcW w:w="4690" w:type="dxa"/>
-          </w:tcPr>
-          <w:p>
-            <w:pPr>
-              <w:pStyle w:val="NormalWeb"/>
-              <w:spacing w:after="0" w:afterAutospacing="0" w:line="276" w:lineRule="auto"/>
-              <w:jc w:val="center"/>
-              <w:rPr>
-                <w:bCs/>
-                <w:color w:val="000000" w:themeColor="text1"/>
-                <w:sz w:val="28"/>
-                <w:szCs w:val="28"/>
-              </w:rPr>
-            </w:pPr>
-            <w:r>
-              <w:rPr>
-                <w:bCs/>
-                <w:color w:val="000000" w:themeColor="text1"/>
-                <w:sz w:val="28"/>
-                <w:szCs w:val="28"/>
-              </w:rPr>
-              <w:t>UBND PHƯỜNG DƯƠNG NỘI</w:t>
-            </w:r>
-          </w:p>
-          <w:p>
-            <w:pPr>
-              <w:pStyle w:val="NormalWeb"/>
-              <w:spacing w:after="0" w:afterAutospacing="0" w:line="276" w:lineRule="auto"/>
-              <w:jc w:val="center"/>
-              <w:rPr>
-                <w:b/>
-                <w:bCs/>
-                <w:color w:val="000000" w:themeColor="text1"/>
-                <w:sz w:val="28"/>
-                <w:szCs w:val="28"/>
-              </w:rPr>
-            </w:pPr>
-            <w:r>
-              <w:rPr>
-                <w:b/>
-                <w:bCs/>
-                <w:color w:val="000000" w:themeColor="text1"/>
-                <w:sz w:val="28"/>
-                <w:szCs w:val="28"/>
-              </w:rPr>
-              <w:t>TRƯỜNG THCS LÊ QUÝ ĐÔN</w:t>
-            </w:r>
-          </w:p>
-        </w:tc>
-        <w:tc>
-          <w:tcPr>
-            <w:tcW w:w="4670" w:type="dxa"/>
-          </w:tcPr>
-          <w:p>
-            <w:pPr>
-              <w:pStyle w:val="NormalWeb"/>
-              <w:shd w:val="clear" w:color="auto" w:fill="FFFFFF"/>
-              <w:spacing w:after="0" w:afterAutospacing="0"/>
-              <w:jc w:val="center"/>
-              <w:rPr>
-                <w:b/>
-                <w:bCs/>
-                <w:color w:val="000000" w:themeColor="text1"/>
-                <w:sz w:val="28"/>
-                <w:szCs w:val="28"/>
-              </w:rPr>
-            </w:pPr>
-            <w:r>
-              <w:rPr>
-                <w:b/>
-                <w:bCs/>
-                <w:color w:val="000000" w:themeColor="text1"/>
-                <w:sz w:val="28"/>
-                <w:szCs w:val="28"/>
-              </w:rPr>
-              <w:t>ĐỀ CƯƠNG ÔN TẬP HỌC KÌ II</w:t>
-            </w:r>
-          </w:p>
-          <w:p>
-            <w:pPr>
-              <w:pStyle w:val="NormalWeb"/>
-              <w:shd w:val="clear" w:color="auto" w:fill="FFFFFF"/>
-              <w:spacing w:after="0" w:afterAutospacing="0"/>
-              <w:jc w:val="center"/>
-              <w:rPr>
-                <w:b/>
-                <w:bCs/>
-                <w:color w:val="000000" w:themeColor="text1"/>
-                <w:sz w:val="28"/>
-                <w:szCs w:val="28"/>
-              </w:rPr>
-            </w:pPr>
-            <w:r>
-              <w:rPr>
-                <w:b/>
-                <w:bCs/>
-                <w:color w:val="000000" w:themeColor="text1"/>
-                <w:sz w:val="28"/>
-                <w:szCs w:val="28"/>
-              </w:rPr>
-              <w:t>MÔN: TIN HỌC 7</w:t>
-            </w:r>
-          </w:p>
-          <w:p>
-            <w:pPr>
-              <w:pStyle w:val="NormalWeb"/>
-              <w:shd w:val="clear" w:color="auto" w:fill="FFFFFF"/>
-              <w:spacing w:after="0" w:afterAutospacing="0"/>
-              <w:jc w:val="center"/>
-              <w:rPr>
-                <w:b/>
-                <w:bCs/>
-                <w:color w:val="000000" w:themeColor="text1"/>
-                <w:sz w:val="28"/>
-                <w:szCs w:val="28"/>
-              </w:rPr>
-            </w:pPr>
-            <w:r>
-              <w:rPr>
-                <w:b/>
-                <w:bCs/>
-                <w:color w:val="000000" w:themeColor="text1"/>
-                <w:sz w:val="28"/>
-                <w:szCs w:val="28"/>
-              </w:rPr>
-              <w:t>Năm học: 2025 – 2026</w:t>
-            </w:r>
-          </w:p>
-          <w:p>
-            <w:pPr>
-              <w:pStyle w:val="NormalWeb"/>
-              <w:shd w:val="clear" w:color="auto" w:fill="FFFFFF"/>
-              <w:spacing w:after="0" w:afterAutospacing="0"/>
-              <w:jc w:val="center"/>
-              <w:rPr>
-                <w:b/>
-                <w:bCs/>
-                <w:color w:val="000000" w:themeColor="text1"/>
-                <w:sz w:val="28"/>
-                <w:szCs w:val="28"/>
-              </w:rPr>
-            </w:pPr>
-          </w:p>
-        </w:tc>
-      </w:tr>
-    </w:tbl>
-    <w:p>
-      <w:pPr>
-        <w:spacing w:after="0" w:line="276" w:lineRule="auto"/>
-        <w:rPr>
-          <w:rFonts w:cs="Times New Roman"/>
-          <w:b/>
-          <w:color w:val="000000" w:themeColor="text1"/>
-          <w:sz w:val="28"/>
-          <w:szCs w:val="28"/>
-          <w:lang w:val="it-IT"/>
-        </w:rPr>
-      </w:pPr>
-      <w:r>
-        <w:rPr>
-          <w:rFonts w:cs="Times New Roman"/>
-          <w:b/>
-          <w:color w:val="000000" w:themeColor="text1"/>
-          <w:sz w:val="28"/>
-          <w:szCs w:val="28"/>
-          <w:lang w:val="it-IT"/>
-        </w:rPr>
-        <w:t>I. TRẮC NGHIỆM.</w:t>
-      </w:r>
-    </w:p>
     <w:p>
       <w:pPr>
         <w:shd w:val="clear" w:color="auto" w:fill="FFFFFF"/>
@@ -279,6 +88,7 @@
       <w:r>
         <w:rPr>
           <w:rFonts w:eastAsia="Times New Roman" w:cs="Times New Roman"/>
+          <w:b/>
           <w:color w:val="000000" w:themeColor="text1"/>
           <w:sz w:val="28"/>
           <w:szCs w:val="28"/>
@@ -499,11 +309,20 @@
       </w:r>
       <w:r>
         <w:rPr>
-          <w:color w:val="000000" w:themeColor="text1"/>
-          <w:sz w:val="28"/>
-          <w:szCs w:val="28"/>
-        </w:rPr>
-        <w:t> Number.</w:t>
+          <w:b/>
+          <w:color w:val="000000" w:themeColor="text1"/>
+          <w:sz w:val="28"/>
+          <w:szCs w:val="28"/>
+        </w:rPr>
+        <w:t> Number</w:t>
+      </w:r>
+      <w:r>
+        <w:rPr>
+          <w:color w:val="000000" w:themeColor="text1"/>
+          <w:sz w:val="28"/>
+          <w:szCs w:val="28"/>
+        </w:rPr>
+        <w:t>.</w:t>
       </w:r>
       <w:r>
         <w:rPr>
@@ -604,61 +423,13 @@
       <w:pPr>
         <w:pStyle w:val="NormalWeb"/>
         <w:spacing w:after="0" w:afterAutospacing="0"/>
-        <w:rPr>
-          <w:color w:val="000000" w:themeColor="text1"/>
-          <w:sz w:val="28"/>
-          <w:szCs w:val="28"/>
-          <w:shd w:val="clear" w:color="auto" w:fill="FFFFFF"/>
-        </w:rPr>
-      </w:pPr>
-      <w:r>
-        <w:rPr>
-          <w:rStyle w:val="Strong"/>
-          <w:color w:val="000000" w:themeColor="text1"/>
-          <w:sz w:val="28"/>
-          <w:szCs w:val="28"/>
-          <w:shd w:val="clear" w:color="auto" w:fill="FFFFFF"/>
-        </w:rPr>
-        <w:t xml:space="preserve">Câu </w:t>
-      </w:r>
-      <w:r>
-        <w:rPr>
-          <w:rStyle w:val="Strong"/>
-          <w:color w:val="000000" w:themeColor="text1"/>
-          <w:sz w:val="28"/>
-          <w:szCs w:val="28"/>
-          <w:shd w:val="clear" w:color="auto" w:fill="FFFFFF"/>
-        </w:rPr>
-        <w:t>3</w:t>
-      </w:r>
-      <w:r>
-        <w:rPr>
-          <w:rStyle w:val="Strong"/>
-          <w:color w:val="000000" w:themeColor="text1"/>
-          <w:sz w:val="28"/>
-          <w:szCs w:val="28"/>
-          <w:shd w:val="clear" w:color="auto" w:fill="FFFFFF"/>
-        </w:rPr>
-        <w:t xml:space="preserve">: </w:t>
-      </w:r>
-      <w:r>
-        <w:rPr>
-          <w:color w:val="000000" w:themeColor="text1"/>
-          <w:sz w:val="28"/>
-          <w:szCs w:val="28"/>
-          <w:shd w:val="clear" w:color="auto" w:fill="FFFFFF"/>
-        </w:rPr>
-        <w:t>Cho sơ đồ khối như sau mô tả thuật toán?</w:t>
-      </w:r>
-      <w:r>
-        <w:rPr>
-          <w:color w:val="000000" w:themeColor="text1"/>
-          <w:sz w:val="28"/>
-          <w:szCs w:val="28"/>
-          <w:shd w:val="clear" w:color="auto" w:fill="FFFFFF"/>
-        </w:rPr>
-        <w:t xml:space="preserve"> </w:t>
-      </w:r>
+        <w:ind w:firstLine="720"/>
+        <w:rPr>
+          <w:color w:val="000000" w:themeColor="text1"/>
+          <w:sz w:val="28"/>
+          <w:szCs w:val="28"/>
+        </w:rPr>
+      </w:pPr>
     </w:p>
     <w:p>
       <w:pPr>
@@ -668,12 +439,73 @@
           <w:color w:val="000000" w:themeColor="text1"/>
           <w:sz w:val="28"/>
           <w:szCs w:val="28"/>
+          <w:shd w:val="clear" w:color="auto" w:fill="FFFFFF"/>
+        </w:rPr>
+      </w:pPr>
+      <w:r>
+        <w:rPr>
+          <w:rStyle w:val="Strong"/>
+          <w:color w:val="000000" w:themeColor="text1"/>
+          <w:sz w:val="28"/>
+          <w:szCs w:val="28"/>
+          <w:shd w:val="clear" w:color="auto" w:fill="FFFFFF"/>
+        </w:rPr>
+        <w:t xml:space="preserve">Câu </w:t>
+      </w:r>
+      <w:r>
+        <w:rPr>
+          <w:rStyle w:val="Strong"/>
+          <w:color w:val="000000" w:themeColor="text1"/>
+          <w:sz w:val="28"/>
+          <w:szCs w:val="28"/>
+          <w:shd w:val="clear" w:color="auto" w:fill="FFFFFF"/>
+        </w:rPr>
+        <w:t>3</w:t>
+      </w:r>
+      <w:r>
+        <w:rPr>
+          <w:rStyle w:val="Strong"/>
+          <w:color w:val="000000" w:themeColor="text1"/>
+          <w:sz w:val="28"/>
+          <w:szCs w:val="28"/>
+          <w:shd w:val="clear" w:color="auto" w:fill="FFFFFF"/>
+        </w:rPr>
+        <w:t xml:space="preserve">: </w:t>
+      </w:r>
+      <w:r>
+        <w:rPr>
+          <w:color w:val="000000" w:themeColor="text1"/>
+          <w:sz w:val="28"/>
+          <w:szCs w:val="28"/>
+          <w:shd w:val="clear" w:color="auto" w:fill="FFFFFF"/>
+        </w:rPr>
+        <w:t>Cho sơ đồ khối như sau mô tả thuật toán?</w:t>
+      </w:r>
+      <w:r>
+        <w:rPr>
+          <w:color w:val="000000" w:themeColor="text1"/>
+          <w:sz w:val="28"/>
+          <w:szCs w:val="28"/>
+          <w:shd w:val="clear" w:color="auto" w:fill="FFFFFF"/>
+        </w:rPr>
+        <w:t xml:space="preserve"> </w:t>
+      </w:r>
+    </w:p>
+    <w:p>
+      <w:pPr>
+        <w:pStyle w:val="NormalWeb"/>
+        <w:spacing w:after="0" w:afterAutospacing="0"/>
+        <w:rPr>
+          <w:color w:val="000000" w:themeColor="text1"/>
+          <w:sz w:val="28"/>
+          <w:szCs w:val="28"/>
         </w:rPr>
       </w:pPr>
       <w:r>
         <w:rPr>
           <w:noProof/>
           <w:color w:val="000000" w:themeColor="text1"/>
+          <w:lang w:eastAsia="ko-KR"/>
         </w:rPr>
         <w:drawing>
           <wp:inline distT="0" distB="0" distL="0" distR="0" wp14:anchorId="7F955279" wp14:editId="1E89F7A0">
@@ -809,11 +641,21 @@
       <w:r>
         <w:rPr>
           <w:rFonts w:eastAsia="Times New Roman" w:cs="Times New Roman"/>
-          <w:color w:val="000000" w:themeColor="text1"/>
-          <w:sz w:val="28"/>
-          <w:szCs w:val="28"/>
-        </w:rPr>
-        <w:t> Thuật toán tìm kiếm tên học sinh.</w:t>
+          <w:b/>
+          <w:color w:val="000000" w:themeColor="text1"/>
+          <w:sz w:val="28"/>
+          <w:szCs w:val="28"/>
+        </w:rPr>
+        <w:t> Thuật toán tìm kiếm tên học sinh</w:t>
+      </w:r>
+      <w:r>
+        <w:rPr>
+          <w:rFonts w:eastAsia="Times New Roman" w:cs="Times New Roman"/>
+          <w:color w:val="000000" w:themeColor="text1"/>
+          <w:sz w:val="28"/>
+          <w:szCs w:val="28"/>
+        </w:rPr>
+        <w:t>.</w:t>
       </w:r>
       <w:r>
         <w:rPr>
@@ -993,6 +835,7 @@
         <w:jc w:val="both"/>
         <w:rPr>
           <w:rFonts w:eastAsia="Times New Roman" w:cs="Times New Roman"/>
+          <w:b/>
           <w:color w:val="000000" w:themeColor="text1"/>
           <w:sz w:val="28"/>
           <w:szCs w:val="28"/>
@@ -1012,6 +855,7 @@
       <w:r>
         <w:rPr>
           <w:rFonts w:eastAsia="Times New Roman" w:cs="Times New Roman"/>
+          <w:b/>
           <w:color w:val="000000" w:themeColor="text1"/>
           <w:sz w:val="28"/>
           <w:szCs w:val="28"/>
@@ -1217,12 +1061,12 @@
           <w:sz w:val="28"/>
           <w:szCs w:val="28"/>
         </w:rPr>
-        <w:lastRenderedPageBreak/>
         <w:t>C.</w:t>
       </w:r>
       <w:r>
         <w:rPr>
           <w:rFonts w:eastAsia="Times New Roman" w:cs="Times New Roman"/>
+          <w:b/>
           <w:color w:val="000000" w:themeColor="text1"/>
           <w:sz w:val="28"/>
           <w:szCs w:val="28"/>
@@ -1232,15 +1076,17 @@
       <w:r>
         <w:rPr>
           <w:rFonts w:eastAsia="Times New Roman" w:cs="Times New Roman"/>
-          <w:color w:val="000000" w:themeColor="text1"/>
-          <w:sz w:val="28"/>
-          <w:szCs w:val="28"/>
-        </w:rPr>
-        <w:tab/>
-      </w:r>
-      <w:r>
-        <w:rPr>
-          <w:rFonts w:eastAsia="Times New Roman" w:cs="Times New Roman"/>
+          <w:b/>
+          <w:color w:val="000000" w:themeColor="text1"/>
+          <w:sz w:val="28"/>
+          <w:szCs w:val="28"/>
+        </w:rPr>
+        <w:tab/>
+      </w:r>
+      <w:r>
+        <w:rPr>
+          <w:rFonts w:eastAsia="Times New Roman" w:cs="Times New Roman"/>
+          <w:b/>
           <w:color w:val="000000" w:themeColor="text1"/>
           <w:sz w:val="28"/>
           <w:szCs w:val="28"/>
@@ -1276,6 +1122,19 @@
         </w:rPr>
         <w:t> Có tính thẩm mĩ</w:t>
       </w:r>
+    </w:p>
+    <w:p>
+      <w:pPr>
+        <w:spacing w:after="240" w:line="240" w:lineRule="auto"/>
+        <w:ind w:left="48" w:right="48"/>
+        <w:jc w:val="both"/>
+        <w:rPr>
+          <w:rFonts w:eastAsia="Times New Roman" w:cs="Times New Roman"/>
+          <w:color w:val="000000" w:themeColor="text1"/>
+          <w:sz w:val="28"/>
+          <w:szCs w:val="28"/>
+        </w:rPr>
+      </w:pPr>
     </w:p>
     <w:p>
       <w:pPr>
@@ -1297,6 +1156,7 @@
           <w:sz w:val="28"/>
           <w:szCs w:val="28"/>
         </w:rPr>
+        <w:lastRenderedPageBreak/>
         <w:t>Câu 6:</w:t>
       </w:r>
       <w:r>
@@ -1382,6 +1242,7 @@
       <w:r>
         <w:rPr>
           <w:rFonts w:eastAsia="Times New Roman" w:cs="Times New Roman"/>
+          <w:b/>
           <w:color w:val="000000" w:themeColor="text1"/>
           <w:sz w:val="28"/>
           <w:szCs w:val="28"/>
@@ -1391,6 +1252,7 @@
       <w:r>
         <w:rPr>
           <w:rFonts w:eastAsia="Times New Roman" w:cs="Times New Roman"/>
+          <w:b/>
           <w:color w:val="000000" w:themeColor="text1"/>
           <w:sz w:val="28"/>
           <w:szCs w:val="28"/>
@@ -1425,6 +1287,19 @@
         </w:rPr>
         <w:t>.</w:t>
       </w:r>
+    </w:p>
+    <w:p>
+      <w:pPr>
+        <w:shd w:val="clear" w:color="auto" w:fill="FFFFFF"/>
+        <w:spacing w:after="0" w:line="240" w:lineRule="auto"/>
+        <w:outlineLvl w:val="5"/>
+        <w:rPr>
+          <w:rFonts w:eastAsia="Times New Roman" w:cs="Times New Roman"/>
+          <w:color w:val="000000" w:themeColor="text1"/>
+          <w:sz w:val="28"/>
+          <w:szCs w:val="28"/>
+        </w:rPr>
+      </w:pPr>
     </w:p>
     <w:p>
       <w:pPr>
@@ -1503,11 +1378,21 @@
       <w:r>
         <w:rPr>
           <w:rFonts w:eastAsia="Times New Roman" w:cs="Times New Roman"/>
-          <w:color w:val="000000" w:themeColor="text1"/>
-          <w:sz w:val="28"/>
-          <w:szCs w:val="28"/>
-        </w:rPr>
-        <w:t>A. Color.</w:t>
+          <w:b/>
+          <w:color w:val="000000" w:themeColor="text1"/>
+          <w:sz w:val="28"/>
+          <w:szCs w:val="28"/>
+        </w:rPr>
+        <w:t>A. Color</w:t>
+      </w:r>
+      <w:r>
+        <w:rPr>
+          <w:rFonts w:eastAsia="Times New Roman" w:cs="Times New Roman"/>
+          <w:color w:val="000000" w:themeColor="text1"/>
+          <w:sz w:val="28"/>
+          <w:szCs w:val="28"/>
+        </w:rPr>
+        <w:t>.</w:t>
       </w:r>
       <w:r>
         <w:rPr>
@@ -1578,48 +1463,6 @@
           <w:szCs w:val="28"/>
         </w:rPr>
       </w:pPr>
-      <w:r>
-        <w:rPr>
-          <w:rFonts w:eastAsia="Times New Roman" w:cs="Times New Roman"/>
-          <w:b/>
-          <w:bCs/>
-          <w:color w:val="000000" w:themeColor="text1"/>
-          <w:sz w:val="28"/>
-          <w:szCs w:val="28"/>
-        </w:rPr>
-        <w:t xml:space="preserve">Câu </w:t>
-      </w:r>
-      <w:r>
-        <w:rPr>
-          <w:rFonts w:eastAsia="Times New Roman" w:cs="Times New Roman"/>
-          <w:b/>
-          <w:bCs/>
-          <w:color w:val="000000" w:themeColor="text1"/>
-          <w:sz w:val="28"/>
-          <w:szCs w:val="28"/>
-        </w:rPr>
-        <w:t>8</w:t>
-      </w:r>
-      <w:r>
-        <w:rPr>
-          <w:rFonts w:eastAsia="Times New Roman" w:cs="Times New Roman"/>
-          <w:b/>
-          <w:bCs/>
-          <w:color w:val="000000" w:themeColor="text1"/>
-          <w:sz w:val="28"/>
-          <w:szCs w:val="28"/>
-        </w:rPr>
-        <w:t>:</w:t>
-      </w:r>
-      <w:r>
-        <w:rPr>
-          <w:rFonts w:eastAsia="Times New Roman" w:cs="Times New Roman"/>
-          <w:color w:val="000000" w:themeColor="text1"/>
-          <w:sz w:val="28"/>
-          <w:szCs w:val="28"/>
-        </w:rPr>
-        <w:t> Lựa chọn Outline trong cửa sổ Format Cells dùng để làm gì?</w:t>
-      </w:r>
     </w:p>
     <w:p>
       <w:pPr>
@@ -1635,48 +1478,44 @@
       <w:r>
         <w:rPr>
           <w:rFonts w:eastAsia="Times New Roman" w:cs="Times New Roman"/>
-          <w:color w:val="000000" w:themeColor="text1"/>
-          <w:sz w:val="28"/>
-          <w:szCs w:val="28"/>
-        </w:rPr>
-        <w:t>A. Không kẻ khung.</w:t>
-      </w:r>
-      <w:r>
-        <w:rPr>
-          <w:rFonts w:eastAsia="Times New Roman" w:cs="Times New Roman"/>
-          <w:color w:val="000000" w:themeColor="text1"/>
-          <w:sz w:val="28"/>
-          <w:szCs w:val="28"/>
-        </w:rPr>
-        <w:tab/>
-      </w:r>
-      <w:r>
-        <w:rPr>
-          <w:rFonts w:eastAsia="Times New Roman" w:cs="Times New Roman"/>
-          <w:color w:val="000000" w:themeColor="text1"/>
-          <w:sz w:val="28"/>
-          <w:szCs w:val="28"/>
-        </w:rPr>
-        <w:tab/>
-      </w:r>
-      <w:r>
-        <w:rPr>
-          <w:rFonts w:eastAsia="Times New Roman" w:cs="Times New Roman"/>
-          <w:color w:val="000000" w:themeColor="text1"/>
-          <w:sz w:val="28"/>
-          <w:szCs w:val="28"/>
-        </w:rPr>
-        <w:tab/>
-        <w:t>B. Kẻ khung bên ngoài</w:t>
-      </w:r>
-      <w:r>
-        <w:rPr>
-          <w:rFonts w:eastAsia="Times New Roman" w:cs="Times New Roman"/>
-          <w:color w:val="000000" w:themeColor="text1"/>
-          <w:sz w:val="28"/>
-          <w:szCs w:val="28"/>
-        </w:rPr>
-        <w:t>.</w:t>
+          <w:b/>
+          <w:bCs/>
+          <w:color w:val="000000" w:themeColor="text1"/>
+          <w:sz w:val="28"/>
+          <w:szCs w:val="28"/>
+        </w:rPr>
+        <w:t xml:space="preserve">Câu </w:t>
+      </w:r>
+      <w:r>
+        <w:rPr>
+          <w:rFonts w:eastAsia="Times New Roman" w:cs="Times New Roman"/>
+          <w:b/>
+          <w:bCs/>
+          <w:color w:val="000000" w:themeColor="text1"/>
+          <w:sz w:val="28"/>
+          <w:szCs w:val="28"/>
+        </w:rPr>
+        <w:t>8</w:t>
+      </w:r>
+      <w:r>
+        <w:rPr>
+          <w:rFonts w:eastAsia="Times New Roman" w:cs="Times New Roman"/>
+          <w:b/>
+          <w:bCs/>
+          <w:color w:val="000000" w:themeColor="text1"/>
+          <w:sz w:val="28"/>
+          <w:szCs w:val="28"/>
+        </w:rPr>
+        <w:t>:</w:t>
+      </w:r>
+      <w:r>
+        <w:rPr>
+          <w:rFonts w:eastAsia="Times New Roman" w:cs="Times New Roman"/>
+          <w:color w:val="000000" w:themeColor="text1"/>
+          <w:sz w:val="28"/>
+          <w:szCs w:val="28"/>
+        </w:rPr>
+        <w:t> Lựa chọn Outline trong cửa sổ Format Cells dùng để làm gì?</w:t>
       </w:r>
     </w:p>
     <w:p>
@@ -1697,6 +1536,65 @@
           <w:sz w:val="28"/>
           <w:szCs w:val="28"/>
         </w:rPr>
+        <w:t>A. Không kẻ khung.</w:t>
+      </w:r>
+      <w:r>
+        <w:rPr>
+          <w:rFonts w:eastAsia="Times New Roman" w:cs="Times New Roman"/>
+          <w:color w:val="000000" w:themeColor="text1"/>
+          <w:sz w:val="28"/>
+          <w:szCs w:val="28"/>
+        </w:rPr>
+        <w:tab/>
+      </w:r>
+      <w:r>
+        <w:rPr>
+          <w:rFonts w:eastAsia="Times New Roman" w:cs="Times New Roman"/>
+          <w:color w:val="000000" w:themeColor="text1"/>
+          <w:sz w:val="28"/>
+          <w:szCs w:val="28"/>
+        </w:rPr>
+        <w:tab/>
+      </w:r>
+      <w:r>
+        <w:rPr>
+          <w:rFonts w:eastAsia="Times New Roman" w:cs="Times New Roman"/>
+          <w:color w:val="000000" w:themeColor="text1"/>
+          <w:sz w:val="28"/>
+          <w:szCs w:val="28"/>
+        </w:rPr>
+        <w:tab/>
+        <w:t>B. Kẻ khung bên ngoài</w:t>
+      </w:r>
+      <w:r>
+        <w:rPr>
+          <w:rFonts w:eastAsia="Times New Roman" w:cs="Times New Roman"/>
+          <w:color w:val="000000" w:themeColor="text1"/>
+          <w:sz w:val="28"/>
+          <w:szCs w:val="28"/>
+        </w:rPr>
+        <w:t>.</w:t>
+      </w:r>
+    </w:p>
+    <w:p>
+      <w:pPr>
+        <w:shd w:val="clear" w:color="auto" w:fill="FFFFFF"/>
+        <w:spacing w:after="100" w:afterAutospacing="1" w:line="240" w:lineRule="auto"/>
+        <w:rPr>
+          <w:rFonts w:eastAsia="Times New Roman" w:cs="Times New Roman"/>
+          <w:color w:val="000000" w:themeColor="text1"/>
+          <w:sz w:val="28"/>
+          <w:szCs w:val="28"/>
+        </w:rPr>
+      </w:pPr>
+      <w:r>
+        <w:rPr>
+          <w:rFonts w:eastAsia="Times New Roman" w:cs="Times New Roman"/>
+          <w:b/>
+          <w:color w:val="000000" w:themeColor="text1"/>
+          <w:sz w:val="28"/>
+          <w:szCs w:val="28"/>
+        </w:rPr>
         <w:t>C. Kẻ đường viền ô.</w:t>
       </w:r>
       <w:r>
@@ -1727,6 +1625,18 @@
         <w:tab/>
         <w:t>D. Chọn kiểu đường kẻ</w:t>
       </w:r>
+    </w:p>
+    <w:p>
+      <w:pPr>
+        <w:shd w:val="clear" w:color="auto" w:fill="FFFFFF"/>
+        <w:spacing w:after="100" w:afterAutospacing="1" w:line="240" w:lineRule="auto"/>
+        <w:rPr>
+          <w:rFonts w:eastAsia="Times New Roman" w:cs="Times New Roman"/>
+          <w:color w:val="000000" w:themeColor="text1"/>
+          <w:sz w:val="28"/>
+          <w:szCs w:val="28"/>
+        </w:rPr>
+      </w:pPr>
     </w:p>
     <w:p>
       <w:pPr>
@@ -1858,11 +1768,21 @@
       <w:r>
         <w:rPr>
           <w:rFonts w:eastAsia="Times New Roman" w:cs="Times New Roman"/>
-          <w:color w:val="000000" w:themeColor="text1"/>
-          <w:sz w:val="28"/>
-          <w:szCs w:val="28"/>
-        </w:rPr>
-        <w:t> Sinh động và hấp dẫn.</w:t>
+          <w:b/>
+          <w:color w:val="000000" w:themeColor="text1"/>
+          <w:sz w:val="28"/>
+          <w:szCs w:val="28"/>
+        </w:rPr>
+        <w:t> Sinh động và hấp dẫn</w:t>
+      </w:r>
+      <w:r>
+        <w:rPr>
+          <w:rFonts w:eastAsia="Times New Roman" w:cs="Times New Roman"/>
+          <w:color w:val="000000" w:themeColor="text1"/>
+          <w:sz w:val="28"/>
+          <w:szCs w:val="28"/>
+        </w:rPr>
+        <w:t>.</w:t>
       </w:r>
       <w:r>
         <w:rPr>
@@ -2172,6 +2092,7 @@
       <w:r>
         <w:rPr>
           <w:rFonts w:eastAsia="Times New Roman" w:cs="Times New Roman"/>
+          <w:b/>
           <w:color w:val="000000" w:themeColor="text1"/>
           <w:sz w:val="28"/>
           <w:szCs w:val="28"/>
@@ -2380,6 +2301,7 @@
       <w:r>
         <w:rPr>
           <w:rFonts w:eastAsia="Times New Roman" w:cs="Times New Roman"/>
+          <w:b/>
           <w:color w:val="000000" w:themeColor="text1"/>
           <w:sz w:val="28"/>
           <w:szCs w:val="28"/>
@@ -2564,11 +2486,23 @@
           <w:sz w:val="28"/>
           <w:szCs w:val="28"/>
         </w:rPr>
-        <w:t>C.</w:t>
-      </w:r>
-      <w:r>
-        <w:rPr>
-          <w:rFonts w:eastAsia="Times New Roman" w:cs="Times New Roman"/>
+        <w:t>C</w:t>
+      </w:r>
+      <w:r>
+        <w:rPr>
+          <w:rFonts w:eastAsia="Times New Roman" w:cs="Times New Roman"/>
+          <w:b/>
+          <w:bCs/>
+          <w:color w:val="000000" w:themeColor="text1"/>
+          <w:sz w:val="28"/>
+          <w:szCs w:val="28"/>
+        </w:rPr>
+        <w:t>.</w:t>
+      </w:r>
+      <w:r>
+        <w:rPr>
+          <w:rFonts w:eastAsia="Times New Roman" w:cs="Times New Roman"/>
+          <w:b/>
           <w:color w:val="000000" w:themeColor="text1"/>
           <w:sz w:val="28"/>
           <w:szCs w:val="28"/>
@@ -2578,6 +2512,7 @@
       <w:r>
         <w:rPr>
           <w:rFonts w:eastAsia="Times New Roman" w:cs="Times New Roman"/>
+          <w:b/>
           <w:color w:val="000000" w:themeColor="text1"/>
           <w:sz w:val="28"/>
           <w:szCs w:val="28"/>
@@ -2747,11 +2682,22 @@
           <w:sz w:val="28"/>
           <w:szCs w:val="28"/>
         </w:rPr>
-        <w:t> 2 </w:t>
-      </w:r>
-      <w:r>
-        <w:rPr>
-          <w:rFonts w:eastAsia="Times New Roman" w:cs="Times New Roman"/>
+        <w:t> </w:t>
+      </w:r>
+      <w:r>
+        <w:rPr>
+          <w:rFonts w:eastAsia="Times New Roman" w:cs="Times New Roman"/>
+          <w:b/>
+          <w:color w:val="000000" w:themeColor="text1"/>
+          <w:sz w:val="28"/>
+          <w:szCs w:val="28"/>
+        </w:rPr>
+        <w:t>2 </w:t>
+      </w:r>
+      <w:r>
+        <w:rPr>
+          <w:rFonts w:eastAsia="Times New Roman" w:cs="Times New Roman"/>
+          <w:b/>
           <w:color w:val="000000" w:themeColor="text1"/>
           <w:sz w:val="28"/>
           <w:szCs w:val="28"/>
@@ -2951,16 +2897,8 @@
           <w:sz w:val="28"/>
           <w:szCs w:val="28"/>
         </w:rPr>
-        <w:t>A.</w:t>
-      </w:r>
-      <w:r>
-        <w:rPr>
-          <w:rFonts w:eastAsia="Times New Roman" w:cs="Times New Roman"/>
-          <w:color w:val="000000" w:themeColor="text1"/>
-          <w:sz w:val="28"/>
-          <w:szCs w:val="28"/>
-        </w:rPr>
-        <w:t xml:space="preserve"> 2.</w:t>
+        <w:lastRenderedPageBreak/>
+        <w:t>A. 2.</w:t>
       </w:r>
       <w:r>
         <w:rPr>
@@ -3188,8 +3126,8 @@
           <w:color w:val="000000" w:themeColor="text1"/>
           <w:sz w:val="28"/>
           <w:szCs w:val="28"/>
-        </w:rPr>
-        <w:lastRenderedPageBreak/>
+          <w:lang w:eastAsia="ko-KR"/>
+        </w:rPr>
         <w:drawing>
           <wp:inline distT="0" distB="0" distL="0" distR="0" wp14:anchorId="2DED7EC8" wp14:editId="0B258757">
             <wp:extent cx="6334125" cy="1943100"/>
@@ -3282,20 +3220,12 @@
           <w:sz w:val="28"/>
           <w:szCs w:val="28"/>
         </w:rPr>
-        <w:t>A.</w:t>
-      </w:r>
-      <w:r>
-        <w:rPr>
-          <w:rFonts w:eastAsia="Times New Roman" w:cs="Times New Roman"/>
-          <w:color w:val="000000" w:themeColor="text1"/>
-          <w:sz w:val="28"/>
-          <w:szCs w:val="28"/>
-        </w:rPr>
-        <w:t xml:space="preserve"> =SUM(C3:G3).</w:t>
-      </w:r>
-      <w:r>
-        <w:rPr>
-          <w:rFonts w:eastAsia="Times New Roman" w:cs="Times New Roman"/>
+        <w:t>A. =SUM(C3:G3).</w:t>
+      </w:r>
+      <w:r>
+        <w:rPr>
+          <w:rFonts w:eastAsia="Times New Roman" w:cs="Times New Roman"/>
+          <w:b/>
           <w:color w:val="000000" w:themeColor="text1"/>
           <w:sz w:val="28"/>
           <w:szCs w:val="28"/>
@@ -3592,6 +3522,7 @@
       <w:r>
         <w:rPr>
           <w:rFonts w:eastAsia="Times New Roman" w:cs="Times New Roman"/>
+          <w:b/>
           <w:color w:val="000000" w:themeColor="text1"/>
           <w:sz w:val="28"/>
           <w:szCs w:val="28"/>
@@ -3705,6 +3636,19 @@
         </w:rPr>
         <w:t>.</w:t>
       </w:r>
+    </w:p>
+    <w:p>
+      <w:pPr>
+        <w:spacing w:after="240" w:line="240" w:lineRule="auto"/>
+        <w:ind w:left="48" w:right="48"/>
+        <w:jc w:val="both"/>
+        <w:rPr>
+          <w:rFonts w:eastAsia="Times New Roman" w:cs="Times New Roman"/>
+          <w:color w:val="000000" w:themeColor="text1"/>
+          <w:sz w:val="28"/>
+          <w:szCs w:val="28"/>
+        </w:rPr>
+      </w:pPr>
     </w:p>
     <w:p>
       <w:pPr>
@@ -3827,35 +3771,27 @@
         <w:jc w:val="both"/>
         <w:rPr>
           <w:rFonts w:eastAsia="Times New Roman" w:cs="Times New Roman"/>
-          <w:color w:val="000000" w:themeColor="text1"/>
-          <w:sz w:val="28"/>
-          <w:szCs w:val="28"/>
-        </w:rPr>
-      </w:pPr>
-      <w:r>
-        <w:rPr>
-          <w:rFonts w:eastAsia="Times New Roman" w:cs="Times New Roman"/>
-          <w:b/>
-          <w:color w:val="000000" w:themeColor="text1"/>
-          <w:sz w:val="28"/>
-          <w:szCs w:val="28"/>
-          <w:lang w:val="vi-VN"/>
-        </w:rPr>
-        <w:t>B.</w:t>
-      </w:r>
-      <w:r>
-        <w:rPr>
-          <w:rFonts w:eastAsia="Times New Roman" w:cs="Times New Roman"/>
-          <w:color w:val="000000" w:themeColor="text1"/>
-          <w:sz w:val="28"/>
-          <w:szCs w:val="28"/>
-          <w:lang w:val="vi-VN"/>
-        </w:rPr>
-        <w:t xml:space="preserve"> </w:t>
-      </w:r>
-      <w:r>
-        <w:rPr>
-          <w:rFonts w:eastAsia="Times New Roman" w:cs="Times New Roman"/>
+          <w:b/>
+          <w:color w:val="000000" w:themeColor="text1"/>
+          <w:sz w:val="28"/>
+          <w:szCs w:val="28"/>
+        </w:rPr>
+      </w:pPr>
+      <w:r>
+        <w:rPr>
+          <w:rFonts w:eastAsia="Times New Roman" w:cs="Times New Roman"/>
+          <w:b/>
+          <w:color w:val="000000" w:themeColor="text1"/>
+          <w:sz w:val="28"/>
+          <w:szCs w:val="28"/>
+          <w:lang w:val="vi-VN"/>
+        </w:rPr>
+        <w:t xml:space="preserve">B. </w:t>
+      </w:r>
+      <w:r>
+        <w:rPr>
+          <w:rFonts w:eastAsia="Times New Roman" w:cs="Times New Roman"/>
+          <w:b/>
           <w:color w:val="000000" w:themeColor="text1"/>
           <w:sz w:val="28"/>
           <w:szCs w:val="28"/>
@@ -3987,6 +3923,7 @@
           <w:color w:val="000000" w:themeColor="text1"/>
           <w:sz w:val="28"/>
           <w:szCs w:val="28"/>
+          <w:lang w:val="vi-VN"/>
         </w:rPr>
         <w:t>Nháy nút phải chuột vào tên trang tính rồi nhập tên trang tính mới.</w:t>
       </w:r>
@@ -4004,6 +3941,7 @@
           <w:color w:val="000000" w:themeColor="text1"/>
           <w:sz w:val="28"/>
           <w:szCs w:val="28"/>
+          <w:lang w:val="vi-VN"/>
         </w:rPr>
       </w:pPr>
       <w:r>
@@ -4013,6 +3951,7 @@
           <w:color w:val="000000" w:themeColor="text1"/>
           <w:sz w:val="28"/>
           <w:szCs w:val="28"/>
+          <w:lang w:val="vi-VN"/>
         </w:rPr>
         <w:t xml:space="preserve">Câu </w:t>
       </w:r>
@@ -4023,6 +3962,7 @@
           <w:color w:val="000000" w:themeColor="text1"/>
           <w:sz w:val="28"/>
           <w:szCs w:val="28"/>
+          <w:lang w:val="vi-VN"/>
         </w:rPr>
         <w:t>1</w:t>
       </w:r>
@@ -4033,6 +3973,7 @@
           <w:color w:val="000000" w:themeColor="text1"/>
           <w:sz w:val="28"/>
           <w:szCs w:val="28"/>
+          <w:lang w:val="vi-VN"/>
         </w:rPr>
         <w:t>8</w:t>
       </w:r>
@@ -4043,6 +3984,7 @@
           <w:color w:val="000000" w:themeColor="text1"/>
           <w:sz w:val="28"/>
           <w:szCs w:val="28"/>
+          <w:lang w:val="vi-VN"/>
         </w:rPr>
         <w:t>:</w:t>
       </w:r>
@@ -4052,6 +3994,7 @@
           <w:color w:val="000000" w:themeColor="text1"/>
           <w:sz w:val="28"/>
           <w:szCs w:val="28"/>
+          <w:lang w:val="vi-VN"/>
         </w:rPr>
         <w:t xml:space="preserve"> Phương án nào sau đây là </w:t>
       </w:r>
@@ -4063,6 +4006,7 @@
           <w:sz w:val="28"/>
           <w:szCs w:val="28"/>
           <w:u w:val="single"/>
+          <w:lang w:val="vi-VN"/>
         </w:rPr>
         <w:t>sai</w:t>
       </w:r>
@@ -4072,6 +4016,7 @@
           <w:color w:val="000000" w:themeColor="text1"/>
           <w:sz w:val="28"/>
           <w:szCs w:val="28"/>
+          <w:lang w:val="vi-VN"/>
         </w:rPr>
         <w:t xml:space="preserve"> để thêm một trang tính vào bảng tính?</w:t>
       </w:r>
@@ -4090,6 +4035,7 @@
           <w:color w:val="000000" w:themeColor="text1"/>
           <w:sz w:val="28"/>
           <w:szCs w:val="28"/>
+          <w:lang w:val="vi-VN"/>
         </w:rPr>
       </w:pPr>
       <w:r>
@@ -4099,6 +4045,7 @@
           <w:color w:val="000000" w:themeColor="text1"/>
           <w:sz w:val="28"/>
           <w:szCs w:val="28"/>
+          <w:lang w:val="vi-VN"/>
         </w:rPr>
         <w:t xml:space="preserve">          A.</w:t>
       </w:r>
@@ -4108,6 +4055,7 @@
           <w:color w:val="000000" w:themeColor="text1"/>
           <w:sz w:val="28"/>
           <w:szCs w:val="28"/>
+          <w:lang w:val="vi-VN"/>
         </w:rPr>
         <w:t xml:space="preserve"> </w:t>
       </w:r>
@@ -4117,6 +4065,7 @@
           <w:color w:val="000000" w:themeColor="text1"/>
           <w:sz w:val="28"/>
           <w:szCs w:val="28"/>
+          <w:lang w:val="vi-VN"/>
         </w:rPr>
         <w:t xml:space="preserve">Nháy chuột vào nút </w:t>
       </w:r>
@@ -4127,6 +4076,7 @@
           <w:color w:val="000000" w:themeColor="text1"/>
           <w:sz w:val="28"/>
           <w:szCs w:val="28"/>
+          <w:lang w:eastAsia="ko-KR"/>
         </w:rPr>
         <w:drawing>
           <wp:inline distT="0" distB="0" distL="0" distR="0" wp14:anchorId="39C5CF6D" wp14:editId="74B352A0">
@@ -4171,6 +4121,7 @@
           <w:color w:val="000000" w:themeColor="text1"/>
           <w:sz w:val="28"/>
           <w:szCs w:val="28"/>
+          <w:lang w:val="vi-VN"/>
         </w:rPr>
         <w:t xml:space="preserve"> phía dưới trang tính.</w:t>
       </w:r>
@@ -4198,8 +4149,19 @@
           <w:color w:val="000000" w:themeColor="text1"/>
           <w:sz w:val="28"/>
           <w:szCs w:val="28"/>
-        </w:rPr>
-        <w:t xml:space="preserve">          B.</w:t>
+          <w:lang w:val="vi-VN"/>
+        </w:rPr>
+        <w:t xml:space="preserve">          </w:t>
+      </w:r>
+      <w:r>
+        <w:rPr>
+          <w:rFonts w:cs="Times New Roman"/>
+          <w:b/>
+          <w:color w:val="000000" w:themeColor="text1"/>
+          <w:sz w:val="28"/>
+          <w:szCs w:val="28"/>
+        </w:rPr>
+        <w:t>B.</w:t>
       </w:r>
       <w:r>
         <w:rPr>
@@ -4281,16 +4243,36 @@
           <w:sz w:val="28"/>
           <w:szCs w:val="28"/>
         </w:rPr>
-        <w:t xml:space="preserve">          C. </w:t>
-      </w:r>
-      <w:r>
-        <w:rPr>
-          <w:rFonts w:eastAsia="Times New Roman" w:cs="Times New Roman"/>
-          <w:color w:val="000000" w:themeColor="text1"/>
-          <w:sz w:val="28"/>
-          <w:szCs w:val="28"/>
-        </w:rPr>
-        <w:t>Trong thẻ Insert chọn lệnh Pictures.</w:t>
+        <w:t xml:space="preserve">          </w:t>
+      </w:r>
+      <w:r>
+        <w:rPr>
+          <w:rFonts w:cs="Times New Roman"/>
+          <w:b/>
+          <w:color w:val="000000" w:themeColor="text1"/>
+          <w:sz w:val="28"/>
+          <w:szCs w:val="28"/>
+        </w:rPr>
+        <w:t xml:space="preserve">C. </w:t>
+      </w:r>
+      <w:r>
+        <w:rPr>
+          <w:rFonts w:eastAsia="Times New Roman" w:cs="Times New Roman"/>
+          <w:b/>
+          <w:color w:val="000000" w:themeColor="text1"/>
+          <w:sz w:val="28"/>
+          <w:szCs w:val="28"/>
+        </w:rPr>
+        <w:t>Trong thẻ Insert chọn lệnh Pictures</w:t>
+      </w:r>
+      <w:r>
+        <w:rPr>
+          <w:rFonts w:eastAsia="Times New Roman" w:cs="Times New Roman"/>
+          <w:color w:val="000000" w:themeColor="text1"/>
+          <w:sz w:val="28"/>
+          <w:szCs w:val="28"/>
+        </w:rPr>
+        <w:t>.</w:t>
       </w:r>
       <w:r>
         <w:rPr>
@@ -4326,7 +4308,16 @@
           <w:sz w:val="28"/>
           <w:szCs w:val="28"/>
         </w:rPr>
-        <w:t xml:space="preserve">          D. </w:t>
+        <w:t xml:space="preserve">          </w:t>
+      </w:r>
+      <w:r>
+        <w:rPr>
+          <w:rFonts w:cs="Times New Roman"/>
+          <w:color w:val="000000" w:themeColor="text1"/>
+          <w:sz w:val="28"/>
+          <w:szCs w:val="28"/>
+        </w:rPr>
+        <w:t xml:space="preserve">D. </w:t>
       </w:r>
       <w:r>
         <w:rPr>
@@ -4346,6 +4337,23 @@
         </w:rPr>
         <w:t>ert/Worksheet trong nhóm lệnh Cells.</w:t>
       </w:r>
+    </w:p>
+    <w:p>
+      <w:pPr>
+        <w:tabs>
+          <w:tab w:val="left" w:pos="3402"/>
+          <w:tab w:val="left" w:pos="5669"/>
+          <w:tab w:val="left" w:pos="7937"/>
+        </w:tabs>
+        <w:spacing w:after="0" w:line="276" w:lineRule="auto"/>
+        <w:jc w:val="both"/>
+        <w:rPr>
+          <w:rFonts w:eastAsia="Times New Roman" w:cs="Times New Roman"/>
+          <w:color w:val="000000" w:themeColor="text1"/>
+          <w:sz w:val="28"/>
+          <w:szCs w:val="28"/>
+        </w:rPr>
+      </w:pPr>
     </w:p>
     <w:p>
       <w:pPr>
@@ -4467,6 +4475,7 @@
           <w:sz w:val="28"/>
           <w:szCs w:val="28"/>
         </w:rPr>
+        <w:lastRenderedPageBreak/>
         <w:t>B</w:t>
       </w:r>
       <w:r>
@@ -4483,11 +4492,21 @@
       <w:r>
         <w:rPr>
           <w:rFonts w:eastAsia="Times New Roman" w:cs="Times New Roman"/>
-          <w:color w:val="000000" w:themeColor="text1"/>
-          <w:sz w:val="28"/>
-          <w:szCs w:val="28"/>
-        </w:rPr>
-        <w:t> So sánh lần lượt từ số đầu tiên trong dãy số với số cần tìm.</w:t>
+          <w:b/>
+          <w:color w:val="000000" w:themeColor="text1"/>
+          <w:sz w:val="28"/>
+          <w:szCs w:val="28"/>
+        </w:rPr>
+        <w:t> So sánh lần lượt từ số đầu tiên trong dãy số với số cần tìm</w:t>
+      </w:r>
+      <w:r>
+        <w:rPr>
+          <w:rFonts w:eastAsia="Times New Roman" w:cs="Times New Roman"/>
+          <w:color w:val="000000" w:themeColor="text1"/>
+          <w:sz w:val="28"/>
+          <w:szCs w:val="28"/>
+        </w:rPr>
+        <w:t>.</w:t>
       </w:r>
     </w:p>
     <w:p>
@@ -4586,7 +4605,6 @@
           <w:sz w:val="28"/>
           <w:szCs w:val="28"/>
         </w:rPr>
-        <w:lastRenderedPageBreak/>
         <w:t xml:space="preserve">Câu </w:t>
       </w:r>
       <w:r>
@@ -4639,6 +4657,7 @@
         <w:jc w:val="both"/>
         <w:rPr>
           <w:rFonts w:eastAsia="Times New Roman" w:cs="Times New Roman"/>
+          <w:b/>
           <w:color w:val="000000" w:themeColor="text1"/>
           <w:sz w:val="28"/>
           <w:szCs w:val="28"/>
@@ -4799,6 +4818,7 @@
       <w:r>
         <w:rPr>
           <w:rFonts w:eastAsia="Times New Roman" w:cs="Times New Roman"/>
+          <w:b/>
           <w:color w:val="000000" w:themeColor="text1"/>
           <w:sz w:val="28"/>
           <w:szCs w:val="28"/>
@@ -4893,11 +4913,23 @@
           <w:sz w:val="28"/>
           <w:szCs w:val="28"/>
         </w:rPr>
-        <w:t>A.</w:t>
-      </w:r>
-      <w:r>
-        <w:rPr>
-          <w:rFonts w:eastAsia="Times New Roman" w:cs="Times New Roman"/>
+        <w:t>A</w:t>
+      </w:r>
+      <w:r>
+        <w:rPr>
+          <w:rFonts w:eastAsia="Times New Roman" w:cs="Times New Roman"/>
+          <w:b/>
+          <w:bCs/>
+          <w:color w:val="000000" w:themeColor="text1"/>
+          <w:sz w:val="28"/>
+          <w:szCs w:val="28"/>
+        </w:rPr>
+        <w:t>.</w:t>
+      </w:r>
+      <w:r>
+        <w:rPr>
+          <w:rFonts w:eastAsia="Times New Roman" w:cs="Times New Roman"/>
+          <w:b/>
           <w:color w:val="000000" w:themeColor="text1"/>
           <w:sz w:val="28"/>
           <w:szCs w:val="28"/>
@@ -4907,6 +4939,7 @@
       <w:r>
         <w:rPr>
           <w:rFonts w:eastAsia="Times New Roman" w:cs="Times New Roman"/>
+          <w:b/>
           <w:color w:val="000000" w:themeColor="text1"/>
           <w:sz w:val="28"/>
           <w:szCs w:val="28"/>
@@ -5188,6 +5221,7 @@
         <w:jc w:val="both"/>
         <w:rPr>
           <w:rFonts w:eastAsia="Times New Roman" w:cs="Times New Roman"/>
+          <w:b/>
           <w:color w:val="000000" w:themeColor="text1"/>
           <w:sz w:val="28"/>
           <w:szCs w:val="28"/>
@@ -5211,7 +5245,17 @@
           <w:sz w:val="28"/>
           <w:szCs w:val="28"/>
         </w:rPr>
-        <w:t> Nếu tìm thấy giá trị cần tìm trong dãy A hoặc nếu tìm đến giá trị cuối trong dãy số mà không tìm thấy giá trị cần tìm.</w:t>
+        <w:t> </w:t>
+      </w:r>
+      <w:r>
+        <w:rPr>
+          <w:rFonts w:eastAsia="Times New Roman" w:cs="Times New Roman"/>
+          <w:b/>
+          <w:color w:val="000000" w:themeColor="text1"/>
+          <w:sz w:val="28"/>
+          <w:szCs w:val="28"/>
+        </w:rPr>
+        <w:t>Nếu tìm thấy giá trị cần tìm trong dãy A hoặc nếu tìm đến giá trị cuối trong dãy số mà không tìm thấy giá trị cần tìm.</w:t>
       </w:r>
     </w:p>
     <w:p>
@@ -5955,6 +5999,7 @@
       <w:r>
         <w:rPr>
           <w:rFonts w:eastAsia="Times New Roman" w:cs="Times New Roman"/>
+          <w:b/>
           <w:color w:val="000000" w:themeColor="text1"/>
           <w:sz w:val="28"/>
           <w:szCs w:val="28"/>
@@ -5964,6 +6009,7 @@
       <w:r>
         <w:rPr>
           <w:rFonts w:eastAsia="Times New Roman" w:cs="Times New Roman"/>
+          <w:b/>
           <w:color w:val="000000" w:themeColor="text1"/>
           <w:sz w:val="28"/>
           <w:szCs w:val="28"/>
@@ -6289,6 +6335,7 @@
       <w:r>
         <w:rPr>
           <w:rFonts w:eastAsia="Times New Roman" w:cs="Times New Roman"/>
+          <w:b/>
           <w:color w:val="000000" w:themeColor="text1"/>
           <w:sz w:val="28"/>
           <w:szCs w:val="28"/>
@@ -6298,6 +6345,7 @@
       <w:r>
         <w:rPr>
           <w:rFonts w:eastAsia="Times New Roman" w:cs="Times New Roman"/>
+          <w:b/>
           <w:color w:val="000000" w:themeColor="text1"/>
           <w:sz w:val="28"/>
           <w:szCs w:val="28"/>
@@ -6420,6 +6468,7 @@
           <w:sz w:val="28"/>
           <w:szCs w:val="28"/>
         </w:rPr>
+        <w:lastRenderedPageBreak/>
         <w:t>A. Number.</w:t>
       </w:r>
       <w:r>
@@ -6477,7 +6526,26 @@
           <w:szCs w:val="28"/>
         </w:rPr>
         <w:tab/>
-        <w:t>C. Border.</w:t>
+        <w:t>C</w:t>
+      </w:r>
+      <w:r>
+        <w:rPr>
+          <w:rFonts w:eastAsia="Times New Roman" w:cs="Times New Roman"/>
+          <w:b/>
+          <w:color w:val="000000" w:themeColor="text1"/>
+          <w:sz w:val="28"/>
+          <w:szCs w:val="28"/>
+        </w:rPr>
+        <w:t>. Border</w:t>
+      </w:r>
+      <w:r>
+        <w:rPr>
+          <w:rFonts w:eastAsia="Times New Roman" w:cs="Times New Roman"/>
+          <w:color w:val="000000" w:themeColor="text1"/>
+          <w:sz w:val="28"/>
+          <w:szCs w:val="28"/>
+        </w:rPr>
+        <w:t>.</w:t>
       </w:r>
       <w:r>
         <w:rPr>
@@ -6636,19 +6704,19 @@
         <w:ind w:firstLine="720"/>
         <w:rPr>
           <w:rFonts w:eastAsia="Times New Roman" w:cs="Times New Roman"/>
-          <w:color w:val="000000" w:themeColor="text1"/>
-          <w:sz w:val="28"/>
-          <w:szCs w:val="28"/>
-        </w:rPr>
-      </w:pPr>
-      <w:r>
-        <w:rPr>
-          <w:rFonts w:eastAsia="Times New Roman" w:cs="Times New Roman"/>
-          <w:color w:val="000000" w:themeColor="text1"/>
-          <w:sz w:val="28"/>
-          <w:szCs w:val="28"/>
-        </w:rPr>
-        <w:lastRenderedPageBreak/>
+          <w:b/>
+          <w:color w:val="000000" w:themeColor="text1"/>
+          <w:sz w:val="28"/>
+          <w:szCs w:val="28"/>
+        </w:rPr>
+      </w:pPr>
+      <w:r>
+        <w:rPr>
+          <w:rFonts w:eastAsia="Times New Roman" w:cs="Times New Roman"/>
+          <w:color w:val="000000" w:themeColor="text1"/>
+          <w:sz w:val="28"/>
+          <w:szCs w:val="28"/>
+        </w:rPr>
         <w:t>C. Microsoft Excel.</w:t>
       </w:r>
       <w:r>
@@ -6677,6 +6745,15 @@
           <w:szCs w:val="28"/>
         </w:rPr>
         <w:tab/>
+      </w:r>
+      <w:r>
+        <w:rPr>
+          <w:rFonts w:eastAsia="Times New Roman" w:cs="Times New Roman"/>
+          <w:b/>
+          <w:color w:val="000000" w:themeColor="text1"/>
+          <w:sz w:val="28"/>
+          <w:szCs w:val="28"/>
+        </w:rPr>
         <w:t>D. Microsoft PowerPoint.</w:t>
       </w:r>
     </w:p>
@@ -6805,11 +6882,21 @@
       <w:r>
         <w:rPr>
           <w:rFonts w:eastAsia="Times New Roman" w:cs="Times New Roman"/>
-          <w:color w:val="000000" w:themeColor="text1"/>
-          <w:sz w:val="28"/>
-          <w:szCs w:val="28"/>
-        </w:rPr>
-        <w:t>Trang chiếu có thể hiển thị văn bản, hình ảnh, âm thanh, video, biểu đồ.</w:t>
+          <w:b/>
+          <w:color w:val="000000" w:themeColor="text1"/>
+          <w:sz w:val="28"/>
+          <w:szCs w:val="28"/>
+        </w:rPr>
+        <w:t>Trang chiếu có thể hiển thị văn bản, hình ảnh, âm thanh, video, biểu đồ</w:t>
+      </w:r>
+      <w:r>
+        <w:rPr>
+          <w:rFonts w:eastAsia="Times New Roman" w:cs="Times New Roman"/>
+          <w:color w:val="000000" w:themeColor="text1"/>
+          <w:sz w:val="28"/>
+          <w:szCs w:val="28"/>
+        </w:rPr>
+        <w:t>.</w:t>
       </w:r>
     </w:p>
     <w:p>
@@ -7098,11 +7185,21 @@
       <w:r>
         <w:rPr>
           <w:rFonts w:eastAsia="Times New Roman" w:cs="Times New Roman"/>
-          <w:color w:val="000000" w:themeColor="text1"/>
-          <w:sz w:val="28"/>
-          <w:szCs w:val="28"/>
-        </w:rPr>
-        <w:t> Khi đã tìm thấy hoặc khi đã hết danh sách.</w:t>
+          <w:b/>
+          <w:color w:val="000000" w:themeColor="text1"/>
+          <w:sz w:val="28"/>
+          <w:szCs w:val="28"/>
+        </w:rPr>
+        <w:t> Khi đã tìm thấy hoặc khi đã hết danh sách</w:t>
+      </w:r>
+      <w:r>
+        <w:rPr>
+          <w:rFonts w:eastAsia="Times New Roman" w:cs="Times New Roman"/>
+          <w:color w:val="000000" w:themeColor="text1"/>
+          <w:sz w:val="28"/>
+          <w:szCs w:val="28"/>
+        </w:rPr>
+        <w:t>.</w:t>
       </w:r>
     </w:p>
     <w:p>
@@ -7178,6 +7275,7 @@
         <w:jc w:val="both"/>
         <w:rPr>
           <w:rFonts w:eastAsia="Times New Roman" w:cs="Times New Roman"/>
+          <w:b/>
           <w:color w:val="000000" w:themeColor="text1"/>
           <w:sz w:val="28"/>
           <w:szCs w:val="28"/>
@@ -7320,6 +7418,7 @@
       <w:r>
         <w:rPr>
           <w:rFonts w:eastAsia="Times New Roman" w:cs="Times New Roman"/>
+          <w:b/>
           <w:color w:val="000000" w:themeColor="text1"/>
           <w:sz w:val="28"/>
           <w:szCs w:val="28"/>
@@ -7438,6 +7537,7 @@
         <w:jc w:val="both"/>
         <w:rPr>
           <w:rFonts w:eastAsia="Times New Roman" w:cs="Times New Roman"/>
+          <w:b/>
           <w:color w:val="000000" w:themeColor="text1"/>
           <w:sz w:val="28"/>
           <w:szCs w:val="28"/>
@@ -7526,20 +7626,12 @@
           <w:sz w:val="28"/>
           <w:szCs w:val="28"/>
         </w:rPr>
-        <w:t> </w:t>
-      </w:r>
-      <w:r>
-        <w:rPr>
-          <w:rFonts w:eastAsia="Times New Roman" w:cs="Times New Roman"/>
-          <w:color w:val="000000" w:themeColor="text1"/>
-          <w:sz w:val="28"/>
-          <w:szCs w:val="28"/>
-        </w:rPr>
-        <w:t>(v</w:t>
-      </w:r>
-      <w:r>
-        <w:rPr>
-          <w:rFonts w:eastAsia="Times New Roman" w:cs="Times New Roman"/>
+        <w:t> (v</w:t>
+      </w:r>
+      <w:r>
+        <w:rPr>
+          <w:rFonts w:eastAsia="Times New Roman" w:cs="Times New Roman"/>
+          <w:b/>
           <w:color w:val="000000" w:themeColor="text1"/>
           <w:szCs w:val="28"/>
         </w:rPr>
@@ -7548,6 +7640,7 @@
       <w:r>
         <w:rPr>
           <w:rFonts w:eastAsia="Times New Roman" w:cs="Times New Roman"/>
+          <w:b/>
           <w:color w:val="000000" w:themeColor="text1"/>
           <w:sz w:val="28"/>
           <w:szCs w:val="28"/>
@@ -7769,11 +7862,21 @@
       <w:r>
         <w:rPr>
           <w:rFonts w:eastAsia="Times New Roman" w:cs="Times New Roman"/>
-          <w:color w:val="000000" w:themeColor="text1"/>
-          <w:sz w:val="28"/>
-          <w:szCs w:val="28"/>
-        </w:rPr>
-        <w:t>B. Home/New Slide.</w:t>
+          <w:b/>
+          <w:color w:val="000000" w:themeColor="text1"/>
+          <w:sz w:val="28"/>
+          <w:szCs w:val="28"/>
+        </w:rPr>
+        <w:t>B. Home/New Slide</w:t>
+      </w:r>
+      <w:r>
+        <w:rPr>
+          <w:rFonts w:eastAsia="Times New Roman" w:cs="Times New Roman"/>
+          <w:color w:val="000000" w:themeColor="text1"/>
+          <w:sz w:val="28"/>
+          <w:szCs w:val="28"/>
+        </w:rPr>
+        <w:t>.</w:t>
       </w:r>
     </w:p>
     <w:p>
@@ -7956,11 +8059,21 @@
           <w:szCs w:val="28"/>
         </w:rPr>
         <w:tab/>
+      </w:r>
+      <w:r>
+        <w:rPr>
+          <w:rFonts w:eastAsia="Times New Roman" w:cs="Times New Roman"/>
+          <w:b/>
+          <w:color w:val="000000" w:themeColor="text1"/>
+          <w:sz w:val="28"/>
+          <w:szCs w:val="28"/>
+        </w:rPr>
         <w:t>B. 2.</w:t>
       </w:r>
       <w:r>
         <w:rPr>
           <w:rFonts w:eastAsia="Times New Roman" w:cs="Times New Roman"/>
+          <w:b/>
           <w:color w:val="000000" w:themeColor="text1"/>
           <w:sz w:val="28"/>
           <w:szCs w:val="28"/>
@@ -8012,6 +8125,14 @@
           <w:szCs w:val="28"/>
         </w:rPr>
         <w:tab/>
+      </w:r>
+      <w:r>
+        <w:rPr>
+          <w:rFonts w:eastAsia="Times New Roman" w:cs="Times New Roman"/>
+          <w:color w:val="000000" w:themeColor="text1"/>
+          <w:sz w:val="28"/>
+          <w:szCs w:val="28"/>
+        </w:rPr>
         <w:t>D. 4.</w:t>
       </w:r>
     </w:p>
@@ -8096,11 +8217,20 @@
       </w:pPr>
       <w:r>
         <w:rPr>
-          <w:color w:val="000000" w:themeColor="text1"/>
-          <w:sz w:val="28"/>
-          <w:szCs w:val="28"/>
-        </w:rPr>
-        <w:t>A. Home.</w:t>
+          <w:b/>
+          <w:color w:val="000000" w:themeColor="text1"/>
+          <w:sz w:val="28"/>
+          <w:szCs w:val="28"/>
+        </w:rPr>
+        <w:t>A. Home</w:t>
+      </w:r>
+      <w:r>
+        <w:rPr>
+          <w:color w:val="000000" w:themeColor="text1"/>
+          <w:sz w:val="28"/>
+          <w:szCs w:val="28"/>
+        </w:rPr>
+        <w:t>.</w:t>
       </w:r>
       <w:r>
         <w:rPr>
@@ -8291,7 +8421,6 @@
           <w:sz w:val="28"/>
           <w:szCs w:val="28"/>
         </w:rPr>
-        <w:lastRenderedPageBreak/>
         <w:t>A. </w:t>
       </w:r>
       <w:r>
@@ -8335,11 +8464,21 @@
       <w:r>
         <w:rPr>
           <w:rFonts w:eastAsia="Times New Roman" w:cs="Times New Roman"/>
-          <w:color w:val="000000" w:themeColor="text1"/>
-          <w:sz w:val="28"/>
-          <w:szCs w:val="28"/>
-        </w:rPr>
-        <w:t>Animations.</w:t>
+          <w:b/>
+          <w:color w:val="000000" w:themeColor="text1"/>
+          <w:sz w:val="28"/>
+          <w:szCs w:val="28"/>
+        </w:rPr>
+        <w:t>Animations</w:t>
+      </w:r>
+      <w:r>
+        <w:rPr>
+          <w:rFonts w:eastAsia="Times New Roman" w:cs="Times New Roman"/>
+          <w:color w:val="000000" w:themeColor="text1"/>
+          <w:sz w:val="28"/>
+          <w:szCs w:val="28"/>
+        </w:rPr>
+        <w:t>.</w:t>
       </w:r>
       <w:r>
         <w:rPr>
@@ -8553,15 +8692,7 @@
           <w:sz w:val="28"/>
           <w:szCs w:val="28"/>
         </w:rPr>
-        <w:t xml:space="preserve">B. </w:t>
-      </w:r>
-      <w:r>
-        <w:rPr>
-          <w:color w:val="000000" w:themeColor="text1"/>
-          <w:sz w:val="28"/>
-          <w:szCs w:val="28"/>
-        </w:rPr>
-        <w:t>Format.</w:t>
+        <w:t>B. Format.</w:t>
       </w:r>
       <w:r>
         <w:rPr>
@@ -8765,11 +8896,21 @@
       <w:r>
         <w:rPr>
           <w:rFonts w:eastAsia="Times New Roman" w:cs="Times New Roman"/>
-          <w:color w:val="000000" w:themeColor="text1"/>
-          <w:sz w:val="28"/>
-          <w:szCs w:val="28"/>
-        </w:rPr>
-        <w:t>C. Màu sắc, họa tiết trên hình ảnh không cần trùng khớp với chủ đề.</w:t>
+          <w:b/>
+          <w:color w:val="000000" w:themeColor="text1"/>
+          <w:sz w:val="28"/>
+          <w:szCs w:val="28"/>
+        </w:rPr>
+        <w:t>C. Màu sắc, họa tiết trên hình ảnh không cần trùng khớp với chủ đề</w:t>
+      </w:r>
+      <w:r>
+        <w:rPr>
+          <w:rFonts w:eastAsia="Times New Roman" w:cs="Times New Roman"/>
+          <w:color w:val="000000" w:themeColor="text1"/>
+          <w:sz w:val="28"/>
+          <w:szCs w:val="28"/>
+        </w:rPr>
+        <w:t>.</w:t>
       </w:r>
     </w:p>
     <w:p>
@@ -8970,6 +9111,7 @@
         <w:ind w:left="1440"/>
         <w:rPr>
           <w:rFonts w:eastAsia="Times New Roman" w:cs="Times New Roman"/>
+          <w:b/>
           <w:color w:val="000000" w:themeColor="text1"/>
           <w:sz w:val="28"/>
           <w:szCs w:val="28"/>
@@ -9048,6 +9190,15 @@
           <w:szCs w:val="28"/>
         </w:rPr>
         <w:tab/>
+      </w:r>
+      <w:r>
+        <w:rPr>
+          <w:rFonts w:eastAsia="Times New Roman" w:cs="Times New Roman"/>
+          <w:b/>
+          <w:color w:val="000000" w:themeColor="text1"/>
+          <w:sz w:val="28"/>
+          <w:szCs w:val="28"/>
+        </w:rPr>
         <w:t>D. b) → c) → a) → d).</w:t>
       </w:r>
     </w:p>
@@ -9219,6 +9370,7 @@
       <w:r>
         <w:rPr>
           <w:rFonts w:eastAsia="Times New Roman" w:cs="Times New Roman"/>
+          <w:b/>
           <w:color w:val="000000" w:themeColor="text1"/>
           <w:sz w:val="28"/>
           <w:szCs w:val="28"/>
@@ -9228,6 +9380,7 @@
       <w:r>
         <w:rPr>
           <w:rFonts w:eastAsia="Times New Roman" w:cs="Times New Roman"/>
+          <w:b/>
           <w:color w:val="000000" w:themeColor="text1"/>
           <w:sz w:val="28"/>
           <w:szCs w:val="28"/>
@@ -9527,6 +9680,7 @@
           <w:sz w:val="28"/>
           <w:szCs w:val="28"/>
         </w:rPr>
+        <w:lastRenderedPageBreak/>
         <w:t>e) Xem trước</w:t>
       </w:r>
       <w:r>
@@ -9618,6 +9772,7 @@
         <w:ind w:left="48" w:right="48" w:firstLine="672"/>
         <w:jc w:val="both"/>
         <w:rPr>
+          <w:b/>
           <w:color w:val="000000" w:themeColor="text1"/>
           <w:sz w:val="28"/>
           <w:szCs w:val="28"/>
@@ -9646,6 +9801,14 @@
           <w:szCs w:val="28"/>
         </w:rPr>
         <w:tab/>
+      </w:r>
+      <w:r>
+        <w:rPr>
+          <w:b/>
+          <w:color w:val="000000" w:themeColor="text1"/>
+          <w:sz w:val="28"/>
+          <w:szCs w:val="28"/>
+        </w:rPr>
         <w:t>D. f → b → d → c → a → e.</w:t>
       </w:r>
     </w:p>
@@ -9670,7 +9833,6 @@
           <w:sz w:val="28"/>
           <w:szCs w:val="28"/>
         </w:rPr>
-        <w:lastRenderedPageBreak/>
         <w:t>Câu 40</w:t>
       </w:r>
       <w:r>
@@ -9731,11 +9893,21 @@
       <w:r>
         <w:rPr>
           <w:rFonts w:eastAsia="Times New Roman" w:cs="Times New Roman"/>
-          <w:color w:val="000000" w:themeColor="text1"/>
-          <w:sz w:val="28"/>
-          <w:szCs w:val="28"/>
-        </w:rPr>
-        <w:t> Thu hẹp danh sách tìm kiếm chỉ còn một nửa.</w:t>
+          <w:b/>
+          <w:color w:val="000000" w:themeColor="text1"/>
+          <w:sz w:val="28"/>
+          <w:szCs w:val="28"/>
+        </w:rPr>
+        <w:t> Thu hẹp danh sách tìm kiếm chỉ còn một nửa</w:t>
+      </w:r>
+      <w:r>
+        <w:rPr>
+          <w:rFonts w:eastAsia="Times New Roman" w:cs="Times New Roman"/>
+          <w:color w:val="000000" w:themeColor="text1"/>
+          <w:sz w:val="28"/>
+          <w:szCs w:val="28"/>
+        </w:rPr>
+        <w:t>.</w:t>
       </w:r>
     </w:p>
     <w:p>
@@ -9908,6 +10080,7 @@
         <w:jc w:val="both"/>
         <w:rPr>
           <w:rFonts w:eastAsia="Times New Roman" w:cs="Times New Roman"/>
+          <w:b/>
           <w:color w:val="000000" w:themeColor="text1"/>
           <w:sz w:val="28"/>
           <w:szCs w:val="28"/>
@@ -9952,10 +10125,10 @@
             <v:path o:extrusionok="f" gradientshapeok="t" o:connecttype="rect"/>
             <o:lock v:ext="edit" aspectratio="t"/>
           </v:shapetype>
-          <v:shape id="_x0000_i1025" type="#_x0000_t75" alt="" style="width:14.3pt;height:14.3pt;mso-width-percent:0;mso-height-percent:0;mso-width-percent:0;mso-height-percent:0" o:ole="">
+          <v:shape id="_x0000_i1025" type="#_x0000_t75" alt="" style="width:14.5pt;height:14.5pt;mso-width-percent:0;mso-height-percent:0;mso-width-percent:0;mso-height-percent:0" o:ole="">
             <v:imagedata r:id="rId14" o:title=""/>
           </v:shape>
-          <o:OLEObject Type="Embed" ProgID="PBrush" ShapeID="_x0000_i1025" DrawAspect="Content" ObjectID="_1837884695" r:id="rId15"/>
+          <o:OLEObject Type="Embed" ProgID="PBrush" ShapeID="_x0000_i1025" DrawAspect="Content" ObjectID="_1838573297" r:id="rId15"/>
         </w:object>
       </w:r>
       <w:r>
@@ -10008,10 +10181,10 @@
           <w:lang w:val="vi-VN"/>
         </w:rPr>
         <w:object w:dxaOrig="375" w:dyaOrig="300">
-          <v:shape id="_x0000_i1026" type="#_x0000_t75" alt="" style="width:18.9pt;height:15.7pt;mso-width-percent:0;mso-height-percent:0;mso-width-percent:0;mso-height-percent:0" o:ole="">
+          <v:shape id="_x0000_i1026" type="#_x0000_t75" alt="" style="width:19pt;height:15.5pt;mso-width-percent:0;mso-height-percent:0;mso-width-percent:0;mso-height-percent:0" o:ole="">
             <v:imagedata r:id="rId16" o:title=""/>
           </v:shape>
-          <o:OLEObject Type="Embed" ProgID="PBrush" ShapeID="_x0000_i1026" DrawAspect="Content" ObjectID="_1837884696" r:id="rId17"/>
+          <o:OLEObject Type="Embed" ProgID="PBrush" ShapeID="_x0000_i1026" DrawAspect="Content" ObjectID="_1838573298" r:id="rId17"/>
         </w:object>
       </w:r>
       <w:r>
@@ -10060,10 +10233,10 @@
           <w:lang w:val="vi-VN"/>
         </w:rPr>
         <w:object w:dxaOrig="255" w:dyaOrig="300">
-          <v:shape id="_x0000_i1027" type="#_x0000_t75" alt="" style="width:12.45pt;height:15.7pt;mso-width-percent:0;mso-height-percent:0;mso-width-percent:0;mso-height-percent:0" o:ole="">
+          <v:shape id="_x0000_i1027" type="#_x0000_t75" alt="" style="width:12.5pt;height:15.5pt;mso-width-percent:0;mso-height-percent:0;mso-width-percent:0;mso-height-percent:0" o:ole="">
             <v:imagedata r:id="rId18" o:title=""/>
           </v:shape>
-          <o:OLEObject Type="Embed" ProgID="PBrush" ShapeID="_x0000_i1027" DrawAspect="Content" ObjectID="_1837884697" r:id="rId19"/>
+          <o:OLEObject Type="Embed" ProgID="PBrush" ShapeID="_x0000_i1027" DrawAspect="Content" ObjectID="_1838573299" r:id="rId19"/>
         </w:object>
       </w:r>
       <w:r>
@@ -10089,12 +10262,14 @@
           <w:rFonts w:eastAsia="Times New Roman" w:cs="Times New Roman"/>
           <w:color w:val="000000" w:themeColor="text1"/>
           <w:szCs w:val="28"/>
-        </w:rPr>
-        <w:tab/>
-      </w:r>
-      <w:r>
-        <w:rPr>
-          <w:rFonts w:eastAsia="Times New Roman" w:cs="Times New Roman"/>
+          <w:lang w:val="vi-VN"/>
+        </w:rPr>
+        <w:tab/>
+      </w:r>
+      <w:r>
+        <w:rPr>
+          <w:rFonts w:eastAsia="Times New Roman" w:cs="Times New Roman"/>
+          <w:b/>
           <w:color w:val="000000" w:themeColor="text1"/>
           <w:sz w:val="28"/>
           <w:szCs w:val="28"/>
@@ -10105,16 +10280,17 @@
       <w:r>
         <w:rPr>
           <w:rFonts w:eastAsia="Times New Roman" w:cs="Times New Roman"/>
+          <w:b/>
           <w:color w:val="000000" w:themeColor="text1"/>
           <w:sz w:val="28"/>
           <w:szCs w:val="28"/>
           <w:lang w:val="vi-VN"/>
         </w:rPr>
         <w:object w:dxaOrig="285" w:dyaOrig="315">
-          <v:shape id="_x0000_i1028" type="#_x0000_t75" alt="" style="width:14.3pt;height:15.7pt;mso-width-percent:0;mso-height-percent:0;mso-width-percent:0;mso-height-percent:0" o:ole="">
+          <v:shape id="_x0000_i1028" type="#_x0000_t75" alt="" style="width:14.5pt;height:15.5pt;mso-width-percent:0;mso-height-percent:0;mso-width-percent:0;mso-height-percent:0" o:ole="">
             <v:imagedata r:id="rId20" o:title=""/>
           </v:shape>
-          <o:OLEObject Type="Embed" ProgID="PBrush" ShapeID="_x0000_i1028" DrawAspect="Content" ObjectID="_1837884698" r:id="rId21"/>
+          <o:OLEObject Type="Embed" ProgID="PBrush" ShapeID="_x0000_i1028" DrawAspect="Content" ObjectID="_1838573300" r:id="rId21"/>
         </w:object>
       </w:r>
     </w:p>
@@ -10149,6 +10325,7 @@
           <w:color w:val="000000" w:themeColor="text1"/>
           <w:sz w:val="28"/>
           <w:szCs w:val="28"/>
+          <w:lang w:val="vi-VN"/>
         </w:rPr>
         <w:t>4</w:t>
       </w:r>
@@ -10170,6 +10347,7 @@
           <w:color w:val="000000" w:themeColor="text1"/>
           <w:sz w:val="28"/>
           <w:szCs w:val="28"/>
+          <w:lang w:val="vi-VN"/>
         </w:rPr>
         <w:t>:</w:t>
       </w:r>
@@ -10191,6 +10369,7 @@
         <w:jc w:val="both"/>
         <w:rPr>
           <w:rFonts w:eastAsia="Times New Roman" w:cs="Times New Roman"/>
+          <w:b/>
           <w:color w:val="000000" w:themeColor="text1"/>
           <w:sz w:val="28"/>
           <w:szCs w:val="28"/>
@@ -10278,6 +10457,16 @@
           <w:lang w:val="vi-VN"/>
         </w:rPr>
         <w:tab/>
+      </w:r>
+      <w:r>
+        <w:rPr>
+          <w:rFonts w:eastAsia="Times New Roman" w:cs="Times New Roman"/>
+          <w:b/>
+          <w:color w:val="000000" w:themeColor="text1"/>
+          <w:sz w:val="28"/>
+          <w:szCs w:val="28"/>
+          <w:lang w:val="vi-VN"/>
+        </w:rPr>
         <w:t>D. A2:A7</w:t>
       </w:r>
     </w:p>
@@ -10312,6 +10501,7 @@
           <w:color w:val="000000" w:themeColor="text1"/>
           <w:sz w:val="28"/>
           <w:szCs w:val="28"/>
+          <w:lang w:val="vi-VN"/>
         </w:rPr>
         <w:t>4</w:t>
       </w:r>
@@ -10347,6 +10537,7 @@
           <w:color w:val="000000" w:themeColor="text1"/>
           <w:sz w:val="28"/>
           <w:szCs w:val="28"/>
+          <w:lang w:val="vi-VN"/>
         </w:rPr>
       </w:pPr>
       <w:r>
@@ -10376,14 +10567,26 @@
           <w:szCs w:val="28"/>
           <w:lang w:val="vi-VN"/>
         </w:rPr>
-        <w:t xml:space="preserve">                       B. Tính toán</w:t>
-      </w:r>
-      <w:r>
-        <w:rPr>
-          <w:rFonts w:eastAsia="Times New Roman" w:cs="Times New Roman"/>
-          <w:color w:val="000000" w:themeColor="text1"/>
-          <w:sz w:val="28"/>
-          <w:szCs w:val="28"/>
+        <w:t xml:space="preserve">                       </w:t>
+      </w:r>
+      <w:r>
+        <w:rPr>
+          <w:rFonts w:eastAsia="Times New Roman" w:cs="Times New Roman"/>
+          <w:b/>
+          <w:color w:val="000000" w:themeColor="text1"/>
+          <w:sz w:val="28"/>
+          <w:szCs w:val="28"/>
+          <w:lang w:val="vi-VN"/>
+        </w:rPr>
+        <w:t>B. Tính toán</w:t>
+      </w:r>
+      <w:r>
+        <w:rPr>
+          <w:rFonts w:eastAsia="Times New Roman" w:cs="Times New Roman"/>
+          <w:color w:val="000000" w:themeColor="text1"/>
+          <w:sz w:val="28"/>
+          <w:szCs w:val="28"/>
+          <w:lang w:val="vi-VN"/>
         </w:rPr>
         <w:t>.</w:t>
       </w:r>
@@ -10416,6 +10619,7 @@
           <w:color w:val="000000" w:themeColor="text1"/>
           <w:sz w:val="28"/>
           <w:szCs w:val="28"/>
+          <w:lang w:val="vi-VN"/>
         </w:rPr>
         <w:t>.</w:t>
       </w:r>
@@ -10524,6 +10728,7 @@
           <w:color w:val="000000" w:themeColor="text1"/>
           <w:sz w:val="28"/>
           <w:szCs w:val="28"/>
+          <w:lang w:val="vi-VN"/>
         </w:rPr>
         <w:t>.</w:t>
       </w:r>
@@ -10548,14 +10753,16 @@
           <w:color w:val="000000" w:themeColor="text1"/>
           <w:sz w:val="28"/>
           <w:szCs w:val="28"/>
-        </w:rPr>
-      </w:pPr>
-      <w:r>
-        <w:rPr>
-          <w:rFonts w:eastAsia="Times New Roman" w:cs="Times New Roman"/>
-          <w:color w:val="000000" w:themeColor="text1"/>
-          <w:sz w:val="28"/>
-          <w:szCs w:val="28"/>
+          <w:lang w:val="vi-VN"/>
+        </w:rPr>
+      </w:pPr>
+      <w:r>
+        <w:rPr>
+          <w:rFonts w:eastAsia="Times New Roman" w:cs="Times New Roman"/>
+          <w:color w:val="000000" w:themeColor="text1"/>
+          <w:sz w:val="28"/>
+          <w:szCs w:val="28"/>
+          <w:lang w:val="vi-VN"/>
         </w:rPr>
         <w:t xml:space="preserve">     </w:t>
       </w:r>
@@ -10575,6 +10782,7 @@
           <w:color w:val="000000" w:themeColor="text1"/>
           <w:sz w:val="28"/>
           <w:szCs w:val="28"/>
+          <w:lang w:val="vi-VN"/>
         </w:rPr>
         <w:t>.</w:t>
       </w:r>
@@ -10598,6 +10806,7 @@
           <w:color w:val="000000" w:themeColor="text1"/>
           <w:sz w:val="28"/>
           <w:szCs w:val="28"/>
+          <w:lang w:val="vi-VN"/>
         </w:rPr>
         <w:t xml:space="preserve">    </w:t>
       </w:r>
@@ -10617,6 +10826,7 @@
           <w:color w:val="000000" w:themeColor="text1"/>
           <w:sz w:val="28"/>
           <w:szCs w:val="28"/>
+          <w:lang w:val="vi-VN"/>
         </w:rPr>
         <w:t>.</w:t>
       </w:r>
@@ -10641,20 +10851,23 @@
           <w:color w:val="000000" w:themeColor="text1"/>
           <w:sz w:val="28"/>
           <w:szCs w:val="28"/>
-        </w:rPr>
-      </w:pPr>
-      <w:r>
-        <w:rPr>
-          <w:rFonts w:eastAsia="Times New Roman" w:cs="Times New Roman"/>
-          <w:color w:val="000000" w:themeColor="text1"/>
-          <w:sz w:val="28"/>
-          <w:szCs w:val="28"/>
+          <w:lang w:val="vi-VN"/>
+        </w:rPr>
+      </w:pPr>
+      <w:r>
+        <w:rPr>
+          <w:rFonts w:eastAsia="Times New Roman" w:cs="Times New Roman"/>
+          <w:color w:val="000000" w:themeColor="text1"/>
+          <w:sz w:val="28"/>
+          <w:szCs w:val="28"/>
+          <w:lang w:val="vi-VN"/>
         </w:rPr>
         <w:t xml:space="preserve">    </w:t>
       </w:r>
       <w:r>
         <w:rPr>
           <w:rFonts w:eastAsia="Times New Roman" w:cs="Times New Roman"/>
+          <w:b/>
           <w:color w:val="000000" w:themeColor="text1"/>
           <w:sz w:val="28"/>
           <w:szCs w:val="28"/>
@@ -10668,6 +10881,7 @@
           <w:color w:val="000000" w:themeColor="text1"/>
           <w:sz w:val="28"/>
           <w:szCs w:val="28"/>
+          <w:lang w:val="vi-VN"/>
         </w:rPr>
         <w:t>.</w:t>
       </w:r>
@@ -10703,6 +10917,7 @@
           <w:color w:val="000000" w:themeColor="text1"/>
           <w:sz w:val="28"/>
           <w:szCs w:val="28"/>
+          <w:lang w:val="vi-VN"/>
         </w:rPr>
         <w:t>4</w:t>
       </w:r>
@@ -10733,6 +10948,7 @@
           <w:color w:val="000000" w:themeColor="text1"/>
           <w:sz w:val="28"/>
           <w:szCs w:val="28"/>
+          <w:lang w:val="vi-VN"/>
         </w:rPr>
         <w:t xml:space="preserve">trong phần mềm bảng tính </w:t>
       </w:r>
@@ -10757,21 +10973,34 @@
           <w:color w:val="000000" w:themeColor="text1"/>
           <w:sz w:val="28"/>
           <w:szCs w:val="28"/>
-        </w:rPr>
-      </w:pPr>
-      <w:r>
-        <w:rPr>
-          <w:rFonts w:eastAsia="Times New Roman" w:cs="Times New Roman"/>
-          <w:color w:val="000000" w:themeColor="text1"/>
-          <w:sz w:val="28"/>
-          <w:szCs w:val="28"/>
-          <w:lang w:val="vi-VN"/>
-        </w:rPr>
-        <w:t xml:space="preserve">     A. Ô</w:t>
-      </w:r>
-      <w:r>
-        <w:rPr>
-          <w:rFonts w:eastAsia="Times New Roman" w:cs="Times New Roman"/>
+          <w:lang w:val="vi-VN"/>
+        </w:rPr>
+      </w:pPr>
+      <w:r>
+        <w:rPr>
+          <w:rFonts w:eastAsia="Times New Roman" w:cs="Times New Roman"/>
+          <w:color w:val="000000" w:themeColor="text1"/>
+          <w:sz w:val="28"/>
+          <w:szCs w:val="28"/>
+          <w:lang w:val="vi-VN"/>
+        </w:rPr>
+        <w:t xml:space="preserve">     </w:t>
+      </w:r>
+      <w:r>
+        <w:rPr>
+          <w:rFonts w:eastAsia="Times New Roman" w:cs="Times New Roman"/>
+          <w:b/>
+          <w:color w:val="000000" w:themeColor="text1"/>
+          <w:sz w:val="28"/>
+          <w:szCs w:val="28"/>
+          <w:lang w:val="vi-VN"/>
+        </w:rPr>
+        <w:t>A. Ô</w:t>
+      </w:r>
+      <w:r>
+        <w:rPr>
+          <w:rFonts w:eastAsia="Times New Roman" w:cs="Times New Roman"/>
+          <w:b/>
           <w:color w:val="000000" w:themeColor="text1"/>
           <w:sz w:val="28"/>
           <w:szCs w:val="28"/>
@@ -10781,6 +11010,7 @@
       <w:r>
         <w:rPr>
           <w:rFonts w:eastAsia="Times New Roman" w:cs="Times New Roman"/>
+          <w:b/>
           <w:color w:val="000000" w:themeColor="text1"/>
           <w:sz w:val="28"/>
           <w:szCs w:val="28"/>
@@ -10822,6 +11052,7 @@
           <w:color w:val="000000" w:themeColor="text1"/>
           <w:sz w:val="28"/>
           <w:szCs w:val="28"/>
+          <w:lang w:val="vi-VN"/>
         </w:rPr>
         <w:t>.</w:t>
       </w:r>
@@ -10841,6 +11072,7 @@
           <w:color w:val="000000" w:themeColor="text1"/>
           <w:sz w:val="28"/>
           <w:szCs w:val="28"/>
+          <w:lang w:val="vi-VN"/>
         </w:rPr>
         <w:t>.</w:t>
       </w:r>
@@ -10876,6 +11108,7 @@
           <w:color w:val="000000" w:themeColor="text1"/>
           <w:sz w:val="28"/>
           <w:szCs w:val="28"/>
+          <w:lang w:val="vi-VN"/>
         </w:rPr>
         <w:t>4</w:t>
       </w:r>
@@ -10944,7 +11177,9 @@
           <w:color w:val="000000" w:themeColor="text1"/>
           <w:sz w:val="28"/>
           <w:szCs w:val="28"/>
-        </w:rPr>
+          <w:lang w:val="vi-VN"/>
+        </w:rPr>
+        <w:lastRenderedPageBreak/>
         <w:t xml:space="preserve">  </w:t>
       </w:r>
       <w:r>
@@ -10955,7 +11190,28 @@
           <w:szCs w:val="28"/>
           <w:lang w:val="vi-VN"/>
         </w:rPr>
-        <w:t xml:space="preserve">   C. =&lt;tên hàm&gt;(&lt;các tham số&gt;)                D. =tên hàm, các tham số</w:t>
+        <w:t xml:space="preserve">   </w:t>
+      </w:r>
+      <w:r>
+        <w:rPr>
+          <w:rFonts w:eastAsia="Times New Roman" w:cs="Times New Roman"/>
+          <w:b/>
+          <w:color w:val="000000" w:themeColor="text1"/>
+          <w:sz w:val="28"/>
+          <w:szCs w:val="28"/>
+          <w:lang w:val="vi-VN"/>
+        </w:rPr>
+        <w:t>C. =&lt;tên hàm&gt;(&lt;các tham số&gt;)</w:t>
+      </w:r>
+      <w:r>
+        <w:rPr>
+          <w:rFonts w:eastAsia="Times New Roman" w:cs="Times New Roman"/>
+          <w:color w:val="000000" w:themeColor="text1"/>
+          <w:sz w:val="28"/>
+          <w:szCs w:val="28"/>
+          <w:lang w:val="vi-VN"/>
+        </w:rPr>
+        <w:t xml:space="preserve">                D. =tên hàm, các tham số</w:t>
       </w:r>
     </w:p>
     <w:p>
@@ -10989,6 +11245,7 @@
           <w:color w:val="000000" w:themeColor="text1"/>
           <w:sz w:val="28"/>
           <w:szCs w:val="28"/>
+          <w:lang w:val="vi-VN"/>
         </w:rPr>
         <w:t>47</w:t>
       </w:r>
@@ -11021,6 +11278,7 @@
         <w:jc w:val="both"/>
         <w:rPr>
           <w:rFonts w:eastAsia="Times New Roman" w:cs="Times New Roman"/>
+          <w:b/>
           <w:color w:val="000000" w:themeColor="text1"/>
           <w:sz w:val="28"/>
           <w:szCs w:val="28"/>
@@ -11046,6 +11304,16 @@
           <w:lang w:val="vi-VN"/>
         </w:rPr>
         <w:tab/>
+      </w:r>
+      <w:r>
+        <w:rPr>
+          <w:rFonts w:eastAsia="Times New Roman" w:cs="Times New Roman"/>
+          <w:b/>
+          <w:color w:val="000000" w:themeColor="text1"/>
+          <w:sz w:val="28"/>
+          <w:szCs w:val="28"/>
+          <w:lang w:val="vi-VN"/>
+        </w:rPr>
         <w:t>B. =B5+C5+E5</w:t>
       </w:r>
     </w:p>
@@ -11134,18 +11402,18 @@
           <w:spacing w:val="3"/>
           <w:sz w:val="28"/>
           <w:szCs w:val="28"/>
-        </w:rPr>
-      </w:pPr>
-      <w:r>
-        <w:rPr>
-          <w:rFonts w:eastAsia="Times New Roman" w:cs="Times New Roman"/>
-          <w:b/>
-          <w:color w:val="000000" w:themeColor="text1"/>
-          <w:sz w:val="28"/>
-          <w:szCs w:val="28"/>
-          <w:lang w:val="vi-VN"/>
-        </w:rPr>
-        <w:lastRenderedPageBreak/>
+          <w:lang w:val="vi-VN"/>
+        </w:rPr>
+      </w:pPr>
+      <w:r>
+        <w:rPr>
+          <w:rFonts w:eastAsia="Times New Roman" w:cs="Times New Roman"/>
+          <w:b/>
+          <w:color w:val="000000" w:themeColor="text1"/>
+          <w:sz w:val="28"/>
+          <w:szCs w:val="28"/>
+          <w:lang w:val="vi-VN"/>
+        </w:rPr>
         <w:t>Câu 48:</w:t>
       </w:r>
       <w:r>
@@ -11165,6 +11433,7 @@
           <w:spacing w:val="3"/>
           <w:sz w:val="28"/>
           <w:szCs w:val="28"/>
+          <w:lang w:val="vi-VN"/>
         </w:rPr>
         <w:t>Trong phần mềm powerpoint 2016, để di chuyển một hình ảnh được chọn xuống lớp dưới cùng ta thực hiện như sau:</w:t>
       </w:r>
@@ -11178,6 +11447,7 @@
           <w:spacing w:val="3"/>
           <w:sz w:val="28"/>
           <w:szCs w:val="28"/>
+          <w:lang w:val="vi-VN"/>
         </w:rPr>
       </w:pPr>
       <w:r>
@@ -11187,6 +11457,7 @@
           <w:spacing w:val="3"/>
           <w:sz w:val="28"/>
           <w:szCs w:val="28"/>
+          <w:lang w:val="vi-VN"/>
         </w:rPr>
         <w:t>Bước 1: Nháy chuột phải lên hình ảnh</w:t>
       </w:r>
@@ -11227,12 +11498,13 @@
       <w:r>
         <w:rPr>
           <w:rFonts w:eastAsia="Times New Roman" w:cs="Times New Roman"/>
+          <w:b/>
           <w:color w:val="000000" w:themeColor="text1"/>
           <w:spacing w:val="3"/>
           <w:sz w:val="28"/>
           <w:szCs w:val="28"/>
         </w:rPr>
-        <w:t>A. Bring Forward.</w:t>
+        <w:t>A. Bring Forward</w:t>
       </w:r>
       <w:r>
         <w:rPr>
@@ -11242,7 +11514,7 @@
           <w:sz w:val="28"/>
           <w:szCs w:val="28"/>
         </w:rPr>
-        <w:tab/>
+        <w:t>.</w:t>
       </w:r>
       <w:r>
         <w:rPr>
@@ -11274,8 +11546,16 @@
         </w:rPr>
         <w:tab/>
       </w:r>
-      <w:bookmarkStart w:id="0" w:name="_GoBack"/>
-      <w:bookmarkEnd w:id="0"/>
+      <w:r>
+        <w:rPr>
+          <w:rFonts w:eastAsia="Times New Roman" w:cs="Times New Roman"/>
+          <w:color w:val="000000" w:themeColor="text1"/>
+          <w:spacing w:val="3"/>
+          <w:sz w:val="28"/>
+          <w:szCs w:val="28"/>
+        </w:rPr>
+        <w:tab/>
+      </w:r>
       <w:r>
         <w:rPr>
           <w:rFonts w:eastAsia="Times New Roman" w:cs="Times New Roman"/>
@@ -11448,7 +11728,27 @@
           <w:lang w:val="vi-VN"/>
         </w:rPr>
         <w:tab/>
-        <w:t xml:space="preserve">B. Design   </w:t>
+      </w:r>
+      <w:r>
+        <w:rPr>
+          <w:rFonts w:eastAsia="Times New Roman" w:cs="Times New Roman"/>
+          <w:b/>
+          <w:color w:val="000000" w:themeColor="text1"/>
+          <w:sz w:val="28"/>
+          <w:szCs w:val="28"/>
+          <w:lang w:val="vi-VN"/>
+        </w:rPr>
+        <w:t>B. Design</w:t>
+      </w:r>
+      <w:r>
+        <w:rPr>
+          <w:rFonts w:eastAsia="Times New Roman" w:cs="Times New Roman"/>
+          <w:color w:val="000000" w:themeColor="text1"/>
+          <w:sz w:val="28"/>
+          <w:szCs w:val="28"/>
+          <w:lang w:val="vi-VN"/>
+        </w:rPr>
+        <w:t xml:space="preserve">   </w:t>
       </w:r>
       <w:r>
         <w:rPr>
@@ -11492,6 +11792,29 @@
         <w:tab/>
         <w:t>D. Transitions</w:t>
       </w:r>
+    </w:p>
+    <w:p>
+      <w:pPr>
+        <w:keepNext/>
+        <w:keepLines/>
+        <w:pBdr>
+          <w:top w:val="nil"/>
+          <w:left w:val="nil"/>
+          <w:bottom w:val="nil"/>
+          <w:right w:val="nil"/>
+          <w:between w:val="nil"/>
+        </w:pBdr>
+        <w:spacing w:after="0" w:line="240" w:lineRule="auto"/>
+        <w:ind w:left="45" w:right="45" w:firstLine="672"/>
+        <w:jc w:val="both"/>
+        <w:rPr>
+          <w:rFonts w:eastAsia="Times New Roman" w:cs="Times New Roman"/>
+          <w:color w:val="000000" w:themeColor="text1"/>
+          <w:sz w:val="28"/>
+          <w:szCs w:val="28"/>
+          <w:lang w:val="vi-VN"/>
+        </w:rPr>
+      </w:pPr>
     </w:p>
     <w:p>
       <w:pPr>
@@ -11507,8 +11830,8 @@
           <w:lang w:val="vi-VN"/>
         </w:rPr>
       </w:pPr>
-      <w:bookmarkStart w:id="1" w:name="_heading=h.30j0zll" w:colFirst="0" w:colLast="0"/>
-      <w:bookmarkEnd w:id="1"/>
+      <w:bookmarkStart w:id="0" w:name="_heading=h.30j0zll" w:colFirst="0" w:colLast="0"/>
+      <w:bookmarkEnd w:id="0"/>
       <w:r>
         <w:rPr>
           <w:rFonts w:eastAsia="Times New Roman" w:cs="Times New Roman"/>
@@ -11527,6 +11850,7 @@
           <w:color w:val="000000" w:themeColor="text1"/>
           <w:sz w:val="28"/>
           <w:szCs w:val="28"/>
+          <w:lang w:val="vi-VN"/>
         </w:rPr>
         <w:t xml:space="preserve"> </w:t>
       </w:r>
@@ -11585,6 +11909,16 @@
           <w:lang w:val="vi-VN"/>
         </w:rPr>
         <w:tab/>
+      </w:r>
+      <w:r>
+        <w:rPr>
+          <w:rFonts w:eastAsia="Times New Roman" w:cs="Times New Roman"/>
+          <w:b/>
+          <w:color w:val="000000" w:themeColor="text1"/>
+          <w:sz w:val="28"/>
+          <w:szCs w:val="28"/>
+          <w:lang w:val="vi-VN"/>
+        </w:rPr>
         <w:t>B. Motion Paths</w:t>
       </w:r>
       <w:r>
@@ -11642,634 +11976,39 @@
     </w:p>
     <w:p>
       <w:pPr>
-        <w:tabs>
-          <w:tab w:val="left" w:pos="992"/>
-        </w:tabs>
-        <w:spacing w:after="0" w:line="276" w:lineRule="auto"/>
+        <w:keepNext/>
+        <w:keepLines/>
+        <w:pBdr>
+          <w:top w:val="nil"/>
+          <w:left w:val="nil"/>
+          <w:bottom w:val="nil"/>
+          <w:right w:val="nil"/>
+          <w:between w:val="nil"/>
+        </w:pBdr>
+        <w:spacing w:after="0" w:line="240" w:lineRule="auto"/>
+        <w:ind w:left="1080"/>
         <w:jc w:val="both"/>
         <w:rPr>
+          <w:rFonts w:eastAsia="Times New Roman" w:cs="Times New Roman"/>
+          <w:color w:val="000000" w:themeColor="text1"/>
+          <w:sz w:val="28"/>
+          <w:szCs w:val="28"/>
+          <w:lang w:val="vi-VN"/>
+        </w:rPr>
+      </w:pPr>
+    </w:p>
+    <w:p>
+      <w:pPr>
+        <w:rPr>
           <w:rFonts w:cs="Times New Roman"/>
-          <w:b/>
-          <w:color w:val="000000" w:themeColor="text1"/>
-          <w:sz w:val="28"/>
-          <w:szCs w:val="28"/>
-        </w:rPr>
-      </w:pPr>
-      <w:r>
-        <w:rPr>
-          <w:rFonts w:cs="Times New Roman"/>
-          <w:b/>
-          <w:color w:val="000000" w:themeColor="text1"/>
-          <w:sz w:val="28"/>
-          <w:szCs w:val="28"/>
-        </w:rPr>
-        <w:t>II. TỰ LUẬN.</w:t>
-      </w:r>
-    </w:p>
-    <w:p>
-      <w:pPr>
-        <w:shd w:val="clear" w:color="auto" w:fill="FFFFFF"/>
-        <w:spacing w:after="100" w:afterAutospacing="1" w:line="432" w:lineRule="atLeast"/>
-        <w:jc w:val="both"/>
-        <w:rPr>
-          <w:rFonts w:eastAsia="Times New Roman" w:cs="Times New Roman"/>
-          <w:color w:val="000000" w:themeColor="text1"/>
-          <w:sz w:val="28"/>
-          <w:szCs w:val="28"/>
-        </w:rPr>
-      </w:pPr>
-      <w:r>
-        <w:rPr>
-          <w:rFonts w:eastAsia="Times New Roman" w:cs="Times New Roman"/>
-          <w:b/>
-          <w:bCs/>
-          <w:color w:val="000000" w:themeColor="text1"/>
-          <w:sz w:val="28"/>
-          <w:szCs w:val="28"/>
-        </w:rPr>
-        <w:t xml:space="preserve">Câu 1. </w:t>
-      </w:r>
-      <w:r>
-        <w:rPr>
-          <w:rFonts w:eastAsia="Times New Roman" w:cs="Times New Roman"/>
-          <w:color w:val="000000" w:themeColor="text1"/>
-          <w:sz w:val="28"/>
-          <w:szCs w:val="28"/>
-        </w:rPr>
-        <w:t>Em hãy viết các bước thực hiện thuật toán tìm kiếm nhị phân để tìm tên bạn “Hòa” trong danh sách như hình sau:</w:t>
-      </w:r>
-    </w:p>
-    <w:p>
-      <w:pPr>
-        <w:shd w:val="clear" w:color="auto" w:fill="FFFFFF"/>
-        <w:spacing w:after="100" w:afterAutospacing="1" w:line="432" w:lineRule="atLeast"/>
-        <w:jc w:val="center"/>
-        <w:rPr>
-          <w:rFonts w:eastAsia="Times New Roman" w:cs="Times New Roman"/>
-          <w:color w:val="000000" w:themeColor="text1"/>
-          <w:sz w:val="28"/>
-          <w:szCs w:val="28"/>
-        </w:rPr>
-      </w:pPr>
-      <w:r>
-        <w:rPr>
-          <w:rFonts w:eastAsia="Times New Roman" w:cs="Times New Roman"/>
-          <w:noProof/>
-          <w:color w:val="000000" w:themeColor="text1"/>
-          <w:sz w:val="28"/>
-          <w:szCs w:val="28"/>
-        </w:rPr>
-        <w:drawing>
-          <wp:inline distT="0" distB="0" distL="0" distR="0" wp14:anchorId="1E75AFA6" wp14:editId="23E03FF5">
-            <wp:extent cx="6248400" cy="504825"/>
-            <wp:effectExtent l="0" t="0" r="0" b="9525"/>
-            <wp:docPr id="4" name="Picture 4" descr="Bộ 30 đề thi Học kì 2 Tin học lớp 7 Kết nối tri thức có đáp án (ảnh 1)"/>
-            <wp:cNvGraphicFramePr>
-              <a:graphicFrameLocks xmlns:a="http://schemas.openxmlformats.org/drawingml/2006/main" noChangeAspect="1"/>
-            </wp:cNvGraphicFramePr>
-            <a:graphic xmlns:a="http://schemas.openxmlformats.org/drawingml/2006/main">
-              <a:graphicData uri="http://schemas.openxmlformats.org/drawingml/2006/picture">
-                <pic:pic xmlns:pic="http://schemas.openxmlformats.org/drawingml/2006/picture">
-                  <pic:nvPicPr>
-                    <pic:cNvPr id="0" name="Picture 1" descr="Bộ 30 đề thi Học kì 2 Tin học lớp 7 Kết nối tri thức có đáp án (ảnh 1)"/>
-                    <pic:cNvPicPr>
-                      <a:picLocks noChangeAspect="1" noChangeArrowheads="1"/>
-                    </pic:cNvPicPr>
-                  </pic:nvPicPr>
-                  <pic:blipFill>
-                    <a:blip r:embed="rId22">
-                      <a:extLst>
-                        <a:ext uri="{28A0092B-C50C-407E-A947-70E740481C1C}">
-                          <a14:useLocalDpi xmlns:a14="http://schemas.microsoft.com/office/drawing/2010/main" val="0"/>
-                        </a:ext>
-                      </a:extLst>
-                    </a:blip>
-                    <a:srcRect/>
-                    <a:stretch>
-                      <a:fillRect/>
-                    </a:stretch>
-                  </pic:blipFill>
-                  <pic:spPr bwMode="auto">
-                    <a:xfrm>
-                      <a:off x="0" y="0"/>
-                      <a:ext cx="6248400" cy="504825"/>
-                    </a:xfrm>
-                    <a:prstGeom prst="rect">
-                      <a:avLst/>
-                    </a:prstGeom>
-                    <a:noFill/>
-                    <a:ln>
-                      <a:noFill/>
-                    </a:ln>
-                  </pic:spPr>
-                </pic:pic>
-              </a:graphicData>
-            </a:graphic>
-          </wp:inline>
-        </w:drawing>
-      </w:r>
-    </w:p>
-    <w:p>
-      <w:pPr>
-        <w:rPr>
-          <w:color w:val="000000" w:themeColor="text1"/>
-          <w:sz w:val="28"/>
-          <w:szCs w:val="28"/>
-        </w:rPr>
-      </w:pPr>
-      <w:r>
-        <w:rPr>
-          <w:rFonts w:cs="Times New Roman"/>
-          <w:b/>
           <w:color w:val="000000" w:themeColor="text1"/>
           <w:sz w:val="28"/>
           <w:szCs w:val="28"/>
           <w:shd w:val="clear" w:color="auto" w:fill="FFFFFF"/>
         </w:rPr>
-        <w:t>Câu 2.</w:t>
-      </w:r>
-      <w:r>
-        <w:rPr>
-          <w:rFonts w:cs="Times New Roman"/>
-          <w:color w:val="000000" w:themeColor="text1"/>
-          <w:sz w:val="28"/>
-          <w:szCs w:val="28"/>
-          <w:shd w:val="clear" w:color="auto" w:fill="FFFFFF"/>
-        </w:rPr>
-        <w:t xml:space="preserve"> </w:t>
-      </w:r>
-      <w:r>
-        <w:rPr>
-          <w:color w:val="000000" w:themeColor="text1"/>
-          <w:sz w:val="28"/>
-          <w:szCs w:val="28"/>
-        </w:rPr>
-        <w:t>Cho danh sách tên các nước sau đây:</w:t>
-      </w:r>
-    </w:p>
-    <w:p>
-      <w:pPr>
-        <w:shd w:val="clear" w:color="auto" w:fill="FFFFFF"/>
-        <w:spacing w:after="150" w:line="240" w:lineRule="auto"/>
-        <w:rPr>
-          <w:rFonts w:eastAsia="Times New Roman" w:cs="Times New Roman"/>
-          <w:color w:val="000000" w:themeColor="text1"/>
-          <w:sz w:val="28"/>
-          <w:szCs w:val="28"/>
-        </w:rPr>
-      </w:pPr>
-      <w:r>
-        <w:rPr>
-          <w:rFonts w:eastAsia="Times New Roman" w:cs="Times New Roman"/>
-          <w:color w:val="000000" w:themeColor="text1"/>
-          <w:sz w:val="28"/>
-          <w:szCs w:val="28"/>
-        </w:rPr>
-        <w:t>Thailand, Vietnam, Laos</w:t>
-      </w:r>
-      <w:r>
-        <w:rPr>
-          <w:rFonts w:eastAsia="Times New Roman" w:cs="Times New Roman"/>
-          <w:color w:val="000000" w:themeColor="text1"/>
-          <w:sz w:val="28"/>
-          <w:szCs w:val="28"/>
-        </w:rPr>
-        <w:t xml:space="preserve">, Canada, </w:t>
-      </w:r>
-      <w:r>
-        <w:rPr>
-          <w:rFonts w:eastAsia="Times New Roman" w:cs="Times New Roman"/>
-          <w:color w:val="000000" w:themeColor="text1"/>
-          <w:sz w:val="28"/>
-          <w:szCs w:val="28"/>
-        </w:rPr>
-        <w:t>China</w:t>
-      </w:r>
-      <w:r>
-        <w:rPr>
-          <w:rFonts w:eastAsia="Times New Roman" w:cs="Times New Roman"/>
-          <w:color w:val="000000" w:themeColor="text1"/>
-          <w:sz w:val="28"/>
-          <w:szCs w:val="28"/>
-        </w:rPr>
-        <w:t xml:space="preserve">, </w:t>
-      </w:r>
-      <w:r>
-        <w:rPr>
-          <w:rFonts w:eastAsia="Times New Roman" w:cs="Times New Roman"/>
-          <w:color w:val="000000" w:themeColor="text1"/>
-          <w:sz w:val="28"/>
-          <w:szCs w:val="28"/>
-        </w:rPr>
-        <w:t>Japan</w:t>
-      </w:r>
-      <w:r>
-        <w:rPr>
-          <w:rFonts w:eastAsia="Times New Roman" w:cs="Times New Roman"/>
-          <w:color w:val="000000" w:themeColor="text1"/>
-          <w:sz w:val="28"/>
-          <w:szCs w:val="28"/>
-        </w:rPr>
-        <w:t xml:space="preserve">, </w:t>
-      </w:r>
-      <w:r>
-        <w:rPr>
-          <w:rFonts w:eastAsia="Times New Roman" w:cs="Times New Roman"/>
-          <w:color w:val="000000" w:themeColor="text1"/>
-          <w:sz w:val="28"/>
-          <w:szCs w:val="28"/>
-        </w:rPr>
-        <w:t>Korea, Singapore, France.</w:t>
-      </w:r>
-    </w:p>
-    <w:p>
-      <w:pPr>
-        <w:shd w:val="clear" w:color="auto" w:fill="FFFFFF"/>
-        <w:spacing w:after="150" w:line="240" w:lineRule="auto"/>
-        <w:rPr>
-          <w:rFonts w:eastAsia="Times New Roman" w:cs="Times New Roman"/>
-          <w:color w:val="000000" w:themeColor="text1"/>
-          <w:sz w:val="28"/>
-          <w:szCs w:val="28"/>
-        </w:rPr>
-      </w:pPr>
-      <w:r>
-        <w:rPr>
-          <w:rFonts w:eastAsia="Times New Roman" w:cs="Times New Roman"/>
-          <w:color w:val="000000" w:themeColor="text1"/>
-          <w:sz w:val="28"/>
-          <w:szCs w:val="28"/>
-        </w:rPr>
-        <w:t>a) Em hãy sắp xếp danh sách tên các nước theo thứ tự trong bảng chữ cái.</w:t>
-      </w:r>
-    </w:p>
-    <w:p>
-      <w:pPr>
-        <w:shd w:val="clear" w:color="auto" w:fill="FFFFFF"/>
-        <w:spacing w:after="150" w:line="240" w:lineRule="auto"/>
-        <w:rPr>
-          <w:rFonts w:eastAsia="Times New Roman" w:cs="Times New Roman"/>
-          <w:color w:val="000000" w:themeColor="text1"/>
-          <w:sz w:val="28"/>
-          <w:szCs w:val="28"/>
-        </w:rPr>
-      </w:pPr>
-      <w:r>
-        <w:rPr>
-          <w:rFonts w:eastAsia="Times New Roman" w:cs="Times New Roman"/>
-          <w:color w:val="000000" w:themeColor="text1"/>
-          <w:sz w:val="28"/>
-          <w:szCs w:val="28"/>
-        </w:rPr>
-        <w:t>b) Em hãy liệt kê các bước tìm kiếm tên nước</w:t>
-      </w:r>
-      <w:r>
-        <w:rPr>
-          <w:rFonts w:eastAsia="Times New Roman" w:cs="Times New Roman"/>
-          <w:color w:val="000000" w:themeColor="text1"/>
-          <w:sz w:val="28"/>
-          <w:szCs w:val="28"/>
-        </w:rPr>
-        <w:t xml:space="preserve"> “</w:t>
-      </w:r>
-      <w:r>
-        <w:rPr>
-          <w:rFonts w:eastAsia="Times New Roman" w:cs="Times New Roman"/>
-          <w:color w:val="000000" w:themeColor="text1"/>
-          <w:sz w:val="28"/>
-          <w:szCs w:val="28"/>
-        </w:rPr>
-        <w:t>Japan</w:t>
-      </w:r>
-      <w:r>
-        <w:rPr>
-          <w:rFonts w:eastAsia="Times New Roman" w:cs="Times New Roman"/>
-          <w:color w:val="000000" w:themeColor="text1"/>
-          <w:sz w:val="28"/>
-          <w:szCs w:val="28"/>
-        </w:rPr>
-        <w:t>”</w:t>
-      </w:r>
-      <w:r>
-        <w:rPr>
-          <w:rFonts w:eastAsia="Times New Roman" w:cs="Times New Roman"/>
-          <w:color w:val="000000" w:themeColor="text1"/>
-          <w:sz w:val="28"/>
-          <w:szCs w:val="28"/>
-        </w:rPr>
-        <w:t xml:space="preserve"> trong danh sách đã sắp xếp theo thuật toán tìm kiếm nhị phân.</w:t>
-      </w:r>
-    </w:p>
-    <w:p>
-      <w:pPr>
-        <w:spacing w:after="240" w:line="276" w:lineRule="auto"/>
-        <w:ind w:right="48"/>
-        <w:jc w:val="both"/>
-        <w:rPr>
-          <w:rFonts w:eastAsia="Times New Roman" w:cs="Times New Roman"/>
-          <w:color w:val="000000" w:themeColor="text1"/>
-          <w:sz w:val="28"/>
-          <w:szCs w:val="28"/>
-        </w:rPr>
-      </w:pPr>
-      <w:r>
-        <w:rPr>
-          <w:rStyle w:val="Strong"/>
-          <w:rFonts w:cs="Times New Roman"/>
-          <w:color w:val="000000" w:themeColor="text1"/>
-          <w:sz w:val="28"/>
-          <w:szCs w:val="28"/>
-          <w:shd w:val="clear" w:color="auto" w:fill="FFFFFF"/>
-        </w:rPr>
-        <w:t>Câu 3</w:t>
-      </w:r>
-      <w:r>
-        <w:rPr>
-          <w:rStyle w:val="Strong"/>
-          <w:rFonts w:cs="Times New Roman"/>
-          <w:color w:val="000000" w:themeColor="text1"/>
-          <w:sz w:val="28"/>
-          <w:szCs w:val="28"/>
-          <w:shd w:val="clear" w:color="auto" w:fill="FFFFFF"/>
-        </w:rPr>
-        <w:t xml:space="preserve">. </w:t>
-      </w:r>
-      <w:r>
-        <w:rPr>
-          <w:rFonts w:cs="Times New Roman"/>
-          <w:color w:val="000000" w:themeColor="text1"/>
-          <w:sz w:val="28"/>
-          <w:szCs w:val="28"/>
-          <w:shd w:val="clear" w:color="auto" w:fill="FFFFFF"/>
-        </w:rPr>
-        <w:t>Để tạo một bài trình chiếu đẹp mắt, em cần lưu ý những điều gì?</w:t>
-      </w:r>
-    </w:p>
-    <w:p>
-      <w:pPr>
-        <w:rPr>
-          <w:rFonts w:cs="Times New Roman"/>
-          <w:color w:val="000000" w:themeColor="text1"/>
-          <w:sz w:val="28"/>
-          <w:szCs w:val="28"/>
-          <w:shd w:val="clear" w:color="auto" w:fill="FFFFFF"/>
-        </w:rPr>
-      </w:pPr>
-      <w:r>
-        <w:rPr>
-          <w:rStyle w:val="Strong"/>
-          <w:rFonts w:cs="Times New Roman"/>
-          <w:color w:val="000000" w:themeColor="text1"/>
-          <w:sz w:val="28"/>
-          <w:szCs w:val="28"/>
-          <w:bdr w:val="none" w:sz="0" w:space="0" w:color="auto" w:frame="1"/>
-          <w:shd w:val="clear" w:color="auto" w:fill="FFFFFF"/>
-        </w:rPr>
-        <w:t>Câu 4</w:t>
-      </w:r>
-      <w:r>
-        <w:rPr>
-          <w:rStyle w:val="Strong"/>
-          <w:rFonts w:cs="Times New Roman"/>
-          <w:color w:val="000000" w:themeColor="text1"/>
-          <w:sz w:val="28"/>
-          <w:szCs w:val="28"/>
-          <w:bdr w:val="none" w:sz="0" w:space="0" w:color="auto" w:frame="1"/>
-          <w:shd w:val="clear" w:color="auto" w:fill="FFFFFF"/>
-        </w:rPr>
-        <w:t xml:space="preserve">. </w:t>
-      </w:r>
-      <w:r>
-        <w:rPr>
-          <w:rFonts w:cs="Times New Roman"/>
-          <w:color w:val="000000" w:themeColor="text1"/>
-          <w:sz w:val="28"/>
-          <w:szCs w:val="28"/>
-          <w:shd w:val="clear" w:color="auto" w:fill="FFFFFF"/>
-        </w:rPr>
-        <w:t>Em hãy nêu các bước theo thứ tự để nhập hàm trực tiếp vào ô tính?</w:t>
-      </w:r>
-    </w:p>
-    <w:p>
-      <w:pPr>
-        <w:rPr>
-          <w:rFonts w:cs="Times New Roman"/>
-          <w:color w:val="000000" w:themeColor="text1"/>
-          <w:sz w:val="28"/>
-          <w:szCs w:val="28"/>
-          <w:shd w:val="clear" w:color="auto" w:fill="FFFFFF"/>
-        </w:rPr>
-      </w:pPr>
-      <w:r>
-        <w:rPr>
-          <w:rFonts w:cs="Times New Roman"/>
-          <w:b/>
-          <w:color w:val="000000" w:themeColor="text1"/>
-          <w:sz w:val="28"/>
-          <w:szCs w:val="28"/>
-          <w:shd w:val="clear" w:color="auto" w:fill="FFFFFF"/>
-        </w:rPr>
-        <w:t>Câ</w:t>
-      </w:r>
-      <w:r>
-        <w:rPr>
-          <w:rStyle w:val="Strong"/>
-          <w:rFonts w:cs="Times New Roman"/>
-          <w:color w:val="000000" w:themeColor="text1"/>
-          <w:sz w:val="28"/>
-          <w:szCs w:val="28"/>
-          <w:shd w:val="clear" w:color="auto" w:fill="FFFFFF"/>
-        </w:rPr>
-        <w:t>u 5</w:t>
-      </w:r>
-      <w:r>
-        <w:rPr>
-          <w:rStyle w:val="Strong"/>
-          <w:rFonts w:cs="Times New Roman"/>
-          <w:color w:val="000000" w:themeColor="text1"/>
-          <w:sz w:val="28"/>
-          <w:szCs w:val="28"/>
-          <w:shd w:val="clear" w:color="auto" w:fill="FFFFFF"/>
-        </w:rPr>
-        <w:t>.</w:t>
-      </w:r>
-      <w:r>
-        <w:rPr>
-          <w:rFonts w:cs="Times New Roman"/>
-          <w:color w:val="000000" w:themeColor="text1"/>
-          <w:sz w:val="28"/>
-          <w:szCs w:val="28"/>
-          <w:shd w:val="clear" w:color="auto" w:fill="FFFFFF"/>
-        </w:rPr>
-        <w:t xml:space="preserve"> Em hãy trình bày </w:t>
-      </w:r>
-      <w:r>
-        <w:rPr>
-          <w:rFonts w:cs="Times New Roman"/>
-          <w:color w:val="000000" w:themeColor="text1"/>
-          <w:sz w:val="28"/>
-          <w:szCs w:val="28"/>
-          <w:shd w:val="clear" w:color="auto" w:fill="FFFFFF"/>
-        </w:rPr>
-        <w:t xml:space="preserve">tên, cách viết và ý nghĩa của </w:t>
-      </w:r>
-      <w:r>
-        <w:rPr>
-          <w:rFonts w:cs="Times New Roman"/>
-          <w:color w:val="000000" w:themeColor="text1"/>
-          <w:sz w:val="28"/>
-          <w:szCs w:val="28"/>
-          <w:shd w:val="clear" w:color="auto" w:fill="FFFFFF"/>
-        </w:rPr>
-        <w:t>5 hàm thông dụng trong phần mềm bảng tính?</w:t>
-      </w:r>
-    </w:p>
-    <w:p>
-      <w:pPr>
-        <w:rPr>
-          <w:rFonts w:cs="Times New Roman"/>
-          <w:color w:val="000000" w:themeColor="text1"/>
-          <w:sz w:val="28"/>
-          <w:szCs w:val="28"/>
-          <w:shd w:val="clear" w:color="auto" w:fill="FFFFFF"/>
-        </w:rPr>
-      </w:pPr>
-      <w:r>
-        <w:rPr>
-          <w:rFonts w:cs="Times New Roman"/>
-          <w:b/>
-          <w:color w:val="000000" w:themeColor="text1"/>
-          <w:sz w:val="28"/>
-          <w:szCs w:val="28"/>
-          <w:shd w:val="clear" w:color="auto" w:fill="FFFFFF"/>
-        </w:rPr>
-        <w:t xml:space="preserve">Câu 6. </w:t>
-      </w:r>
-      <w:r>
-        <w:rPr>
-          <w:rFonts w:cs="Times New Roman"/>
-          <w:color w:val="000000" w:themeColor="text1"/>
-          <w:sz w:val="28"/>
-          <w:szCs w:val="28"/>
-          <w:shd w:val="clear" w:color="auto" w:fill="FFFFFF"/>
-        </w:rPr>
-        <w:t>Em hãy cho biết, mỗi hàm sau cho kết quả như thế nào?</w:t>
-      </w:r>
-    </w:p>
-    <w:p>
-      <w:pPr>
-        <w:pStyle w:val="ListParagraph"/>
-        <w:numPr>
-          <w:ilvl w:val="0"/>
-          <w:numId w:val="9"/>
-        </w:numPr>
-        <w:rPr>
-          <w:rFonts w:cs="Times New Roman"/>
-          <w:color w:val="000000" w:themeColor="text1"/>
-          <w:sz w:val="28"/>
-          <w:szCs w:val="28"/>
-          <w:shd w:val="clear" w:color="auto" w:fill="FFFFFF"/>
-        </w:rPr>
-      </w:pPr>
-      <w:r>
-        <w:rPr>
-          <w:rFonts w:cs="Times New Roman"/>
-          <w:color w:val="000000" w:themeColor="text1"/>
-          <w:sz w:val="28"/>
-          <w:szCs w:val="28"/>
-          <w:shd w:val="clear" w:color="auto" w:fill="FFFFFF"/>
-        </w:rPr>
-        <w:t>=SUM(1,3; “Hà Nội”, 5)</w:t>
-      </w:r>
-    </w:p>
-    <w:p>
-      <w:pPr>
-        <w:pStyle w:val="ListParagraph"/>
-        <w:numPr>
-          <w:ilvl w:val="0"/>
-          <w:numId w:val="9"/>
-        </w:numPr>
-        <w:rPr>
-          <w:rFonts w:cs="Times New Roman"/>
-          <w:color w:val="000000" w:themeColor="text1"/>
-          <w:sz w:val="28"/>
-          <w:szCs w:val="28"/>
-          <w:shd w:val="clear" w:color="auto" w:fill="FFFFFF"/>
-        </w:rPr>
-      </w:pPr>
-      <w:r>
-        <w:rPr>
-          <w:rFonts w:cs="Times New Roman"/>
-          <w:color w:val="000000" w:themeColor="text1"/>
-          <w:sz w:val="28"/>
-          <w:szCs w:val="28"/>
-          <w:shd w:val="clear" w:color="auto" w:fill="FFFFFF"/>
-        </w:rPr>
-        <w:t>=MIN(3,5,2026)+MAX(2016,2027,2029)</w:t>
-      </w:r>
-    </w:p>
-    <w:p>
-      <w:pPr>
-        <w:pStyle w:val="ListParagraph"/>
-        <w:numPr>
-          <w:ilvl w:val="0"/>
-          <w:numId w:val="9"/>
-        </w:numPr>
-        <w:rPr>
-          <w:rFonts w:cs="Times New Roman"/>
-          <w:color w:val="000000" w:themeColor="text1"/>
-          <w:sz w:val="28"/>
-          <w:szCs w:val="28"/>
-          <w:shd w:val="clear" w:color="auto" w:fill="FFFFFF"/>
-        </w:rPr>
-      </w:pPr>
-      <w:r>
-        <w:rPr>
-          <w:rFonts w:cs="Times New Roman"/>
-          <w:color w:val="000000" w:themeColor="text1"/>
-          <w:sz w:val="28"/>
-          <w:szCs w:val="28"/>
-          <w:shd w:val="clear" w:color="auto" w:fill="FFFFFF"/>
-        </w:rPr>
-        <w:t>=COUNT(1,3,5,7,9)</w:t>
-      </w:r>
-    </w:p>
-    <w:p>
-      <w:pPr>
-        <w:pStyle w:val="ListParagraph"/>
-        <w:numPr>
-          <w:ilvl w:val="0"/>
-          <w:numId w:val="9"/>
-        </w:numPr>
-        <w:rPr>
-          <w:rFonts w:cs="Times New Roman"/>
-          <w:color w:val="000000" w:themeColor="text1"/>
-          <w:sz w:val="28"/>
-          <w:szCs w:val="28"/>
-          <w:shd w:val="clear" w:color="auto" w:fill="FFFFFF"/>
-        </w:rPr>
-      </w:pPr>
-      <w:r>
-        <w:rPr>
-          <w:rFonts w:cs="Times New Roman"/>
-          <w:color w:val="000000" w:themeColor="text1"/>
-          <w:sz w:val="28"/>
-          <w:szCs w:val="28"/>
-          <w:shd w:val="clear" w:color="auto" w:fill="FFFFFF"/>
-        </w:rPr>
-        <w:t>=AVERAGE(1,3,5)/2</w:t>
-      </w:r>
-    </w:p>
-    <w:p>
-      <w:pPr>
-        <w:rPr>
-          <w:rFonts w:cs="Times New Roman"/>
-          <w:color w:val="000000" w:themeColor="text1"/>
-          <w:sz w:val="28"/>
-          <w:szCs w:val="28"/>
-          <w:shd w:val="clear" w:color="auto" w:fill="FFFFFF"/>
-        </w:rPr>
-      </w:pPr>
+      </w:pPr>
+      <w:bookmarkStart w:id="1" w:name="_GoBack"/>
+      <w:bookmarkEnd w:id="1"/>
     </w:p>
     <w:p>
       <w:pPr>
@@ -12285,7 +12024,7 @@
       </w:pPr>
     </w:p>
     <w:sectPr>
-      <w:headerReference w:type="default" r:id="rId23"/>
+      <w:headerReference w:type="default" r:id="rId22"/>
       <w:pgSz w:w="11907" w:h="16840" w:code="9"/>
       <w:pgMar w:top="426" w:right="851" w:bottom="567" w:left="1440" w:header="397" w:footer="397" w:gutter="0"/>
       <w:cols w:space="720"/>
@@ -12380,7 +12119,7 @@
           <w:rPr>
             <w:noProof/>
           </w:rPr>
-          <w:t>8</w:t>
+          <w:t>7</w:t>
         </w:r>
         <w:r>
           <w:rPr>
@@ -14380,7 +14119,7 @@
 </file>
 
 <file path=customXml/itemProps1.xml><?xml version="1.0" encoding="utf-8"?>
-<ds:datastoreItem xmlns:ds="http://schemas.openxmlformats.org/officeDocument/2006/customXml" ds:itemID="{F7815D10-ABEE-41B5-BEA5-7F8979FAA7FB}">
+<ds:datastoreItem xmlns:ds="http://schemas.openxmlformats.org/officeDocument/2006/customXml" ds:itemID="{3DD067C6-F2C2-4B81-9BE0-8740FE046284}">
   <ds:schemaRefs>
     <ds:schemaRef ds:uri="http://schemas.openxmlformats.org/officeDocument/2006/bibliography"/>
   </ds:schemaRefs>

</xml_diff>